<commit_message>
Update docs and docx files: 1,162 presentations throughout
Co-Authored-By: Claude Sonnet 4.6 <noreply@anthropic.com>
</commit_message>
<xml_diff>
--- a/VSS_2026_Scheduler_Guide.docx
+++ b/VSS_2026_Scheduler_Guide.docx
@@ -2194,7 +2194,7 @@
         </w:numPr>
       </w:pPr>
       <w:r>
-        <w:t xml:space="preserve">Lists 190 presentations from VSS 2026</w:t>
+        <w:t xml:space="preserve">Lists 1,162 presentations from VSS 2026</w:t>
       </w:r>
     </w:p>
     <w:p>
@@ -4678,7 +4678,7 @@
         <w:t xml:space="preserve"> </w:t>
       </w:r>
       <w:r>
-        <w:t xml:space="preserve">“190 presentations available”</w:t>
+        <w:t xml:space="preserve">“1,162 presentations available”</w:t>
       </w:r>
     </w:p>
     <w:bookmarkEnd w:id="48"/>
@@ -5431,7 +5431,7 @@
         </w:numPr>
       </w:pPr>
       <w:r>
-        <w:t xml:space="preserve">Don’t try to export all 190 at once</w:t>
+        <w:t xml:space="preserve">Don’t try to export all sessions at once</w:t>
       </w:r>
     </w:p>
     <w:bookmarkEnd w:id="56"/>

</xml_diff>

<commit_message>
Update docs and docx files: 1,190 presentations throughout
Co-Authored-By: Claude Sonnet 4.6 <noreply@anthropic.com>
</commit_message>
<xml_diff>
--- a/VSS_2026_Scheduler_Guide.docx
+++ b/VSS_2026_Scheduler_Guide.docx
@@ -2194,7 +2194,7 @@
         </w:numPr>
       </w:pPr>
       <w:r>
-        <w:t xml:space="preserve">Lists 1,162 presentations from VSS 2026</w:t>
+        <w:t xml:space="preserve">Lists 1,190 presentations from VSS 2026</w:t>
       </w:r>
     </w:p>
     <w:p>
@@ -4678,7 +4678,7 @@
         <w:t xml:space="preserve"> </w:t>
       </w:r>
       <w:r>
-        <w:t xml:space="preserve">“1,162 presentations available”</w:t>
+        <w:t xml:space="preserve">“1,190 presentations available”</w:t>
       </w:r>
     </w:p>
     <w:bookmarkEnd w:id="48"/>

</xml_diff>

<commit_message>
Update README, guide, and docx files with detail modal feature
Co-Authored-By: Claude Sonnet 4.6 <noreply@anthropic.com>
</commit_message>
<xml_diff>
--- a/VSS_2026_Scheduler_Guide.docx
+++ b/VSS_2026_Scheduler_Guide.docx
@@ -2412,19 +2412,51 @@
         <w:t xml:space="preserve"> </w:t>
       </w:r>
       <w:r>
-        <w:t xml:space="preserve">3. Tap a presentation card to select it</w:t>
-      </w:r>
-      <w:r>
-        <w:t xml:space="preserve"> </w:t>
-      </w:r>
-      <w:r>
-        <w:t xml:space="preserve">4. Blue checkmark indicates selection</w:t>
-      </w:r>
-      <w:r>
-        <w:t xml:space="preserve"> </w:t>
-      </w:r>
-      <w:r>
-        <w:t xml:space="preserve">5. Selected count shows at bottom</w:t>
+        <w:t xml:space="preserve">3.</w:t>
+      </w:r>
+      <w:r>
+        <w:t xml:space="preserve"> </w:t>
+      </w:r>
+      <w:r>
+        <w:rPr>
+          <w:b/>
+          <w:bCs/>
+        </w:rPr>
+        <w:t xml:space="preserve">Tap a card</w:t>
+      </w:r>
+      <w:r>
+        <w:t xml:space="preserve"> </w:t>
+      </w:r>
+      <w:r>
+        <w:t xml:space="preserve">to open the full detail view — title, authors, affiliations, and complete abstract</w:t>
+      </w:r>
+      <w:r>
+        <w:t xml:space="preserve"> </w:t>
+      </w:r>
+      <w:r>
+        <w:t xml:space="preserve">4. Tap</w:t>
+      </w:r>
+      <w:r>
+        <w:t xml:space="preserve"> </w:t>
+      </w:r>
+      <w:r>
+        <w:rPr>
+          <w:b/>
+          <w:bCs/>
+        </w:rPr>
+        <w:t xml:space="preserve">“Add to Schedule”</w:t>
+      </w:r>
+      <w:r>
+        <w:t xml:space="preserve"> </w:t>
+      </w:r>
+      <w:r>
+        <w:t xml:space="preserve">inside the detail view to save it</w:t>
+      </w:r>
+      <w:r>
+        <w:t xml:space="preserve"> </w:t>
+      </w:r>
+      <w:r>
+        <w:t xml:space="preserve">5. Blue checkmark on the card indicates it is already saved</w:t>
       </w:r>
     </w:p>
     <w:p>
@@ -2454,7 +2486,7 @@
         <w:t xml:space="preserve"> </w:t>
       </w:r>
       <w:r>
-        <w:t xml:space="preserve">- Topic/keywords</w:t>
+        <w:t xml:space="preserve">- Affiliations</w:t>
       </w:r>
       <w:r>
         <w:t xml:space="preserve"> </w:t>
@@ -2542,13 +2574,29 @@
         <w:t xml:space="preserve"> </w:t>
       </w:r>
       <w:r>
-        <w:t xml:space="preserve">- Tap presentation to view details</w:t>
-      </w:r>
-      <w:r>
-        <w:t xml:space="preserve"> </w:t>
-      </w:r>
-      <w:r>
-        <w:t xml:space="preserve">- Remove button to unselect</w:t>
+        <w:t xml:space="preserve">-</w:t>
+      </w:r>
+      <w:r>
+        <w:t xml:space="preserve"> </w:t>
+      </w:r>
+      <w:r>
+        <w:rPr>
+          <w:b/>
+          <w:bCs/>
+        </w:rPr>
+        <w:t xml:space="preserve">Tap a card</w:t>
+      </w:r>
+      <w:r>
+        <w:t xml:space="preserve"> </w:t>
+      </w:r>
+      <w:r>
+        <w:t xml:space="preserve">to open the full detail view — read the abstract, then remove if needed</w:t>
+      </w:r>
+      <w:r>
+        <w:t xml:space="preserve"> </w:t>
+      </w:r>
+      <w:r>
+        <w:t xml:space="preserve">- Remove button (✕) on each card to unselect directly</w:t>
       </w:r>
       <w:r>
         <w:t xml:space="preserve"> </w:t>

</xml_diff>

<commit_message>
Update Google Calendar export instructions for new step-through Modal UI
Both iOS and Android sections now describe the overlay that shows "Session N of M"
and the Next/Done/Stop buttons, replacing the old "Repeat for each session" phrasing.

Co-Authored-By: Claude Sonnet 4.6 <noreply@anthropic.com>
</commit_message>
<xml_diff>
--- a/VSS_2026_Scheduler_Guide.docx
+++ b/VSS_2026_Scheduler_Guide.docx
@@ -2870,7 +2870,7 @@
           <w:b/>
           <w:bCs/>
         </w:rPr>
-        <w:t xml:space="preserve">“📅 Google Calendar”</w:t>
+        <w:t xml:space="preserve">“Google Calendar”</w:t>
       </w:r>
       <w:r>
         <w:t xml:space="preserve"> </w:t>
@@ -2883,6 +2883,24 @@
       <w:pPr>
         <w:pStyle w:val="Compact"/>
         <w:numPr>
+          <w:ilvl w:val="1"/>
+          <w:numId w:val="1020"/>
+        </w:numPr>
+      </w:pPr>
+      <w:r>
+        <w:t xml:space="preserve">An overlay appears showing</w:t>
+      </w:r>
+      <w:r>
+        <w:t xml:space="preserve"> </w:t>
+      </w:r>
+      <w:r>
+        <w:t xml:space="preserve">“Session 1 of N”</w:t>
+      </w:r>
+    </w:p>
+    <w:p>
+      <w:pPr>
+        <w:pStyle w:val="Compact"/>
+        <w:numPr>
           <w:ilvl w:val="0"/>
           <w:numId w:val="1019"/>
         </w:numPr>
@@ -2904,7 +2922,7 @@
         </w:numPr>
       </w:pPr>
       <w:r>
-        <w:t xml:space="preserve">Google Calendar opens automatically</w:t>
+        <w:t xml:space="preserve">Google Calendar opens with the first session pre-filled</w:t>
       </w:r>
     </w:p>
     <w:p>
@@ -2916,18 +2934,6 @@
         </w:numPr>
       </w:pPr>
       <w:r>
-        <w:t xml:space="preserve">Each session opens as a new event</w:t>
-      </w:r>
-    </w:p>
-    <w:p>
-      <w:pPr>
-        <w:pStyle w:val="Compact"/>
-        <w:numPr>
-          <w:ilvl w:val="1"/>
-          <w:numId w:val="1021"/>
-        </w:numPr>
-      </w:pPr>
-      <w:r>
         <w:t xml:space="preserve">Tap</w:t>
       </w:r>
       <w:r>
@@ -2944,19 +2950,7 @@
         <w:t xml:space="preserve"> </w:t>
       </w:r>
       <w:r>
-        <w:t xml:space="preserve">to add to your calendar</w:t>
-      </w:r>
-    </w:p>
-    <w:p>
-      <w:pPr>
-        <w:pStyle w:val="Compact"/>
-        <w:numPr>
-          <w:ilvl w:val="1"/>
-          <w:numId w:val="1021"/>
-        </w:numPr>
-      </w:pPr>
-      <w:r>
-        <w:t xml:space="preserve">Repeat for each session</w:t>
+        <w:t xml:space="preserve">to add it to your calendar</w:t>
       </w:r>
     </w:p>
     <w:p>
@@ -2972,6 +2966,118 @@
           <w:b/>
           <w:bCs/>
         </w:rPr>
+        <w:t xml:space="preserve">Return to App:</w:t>
+      </w:r>
+    </w:p>
+    <w:p>
+      <w:pPr>
+        <w:pStyle w:val="Compact"/>
+        <w:numPr>
+          <w:ilvl w:val="1"/>
+          <w:numId w:val="1022"/>
+        </w:numPr>
+      </w:pPr>
+      <w:r>
+        <w:t xml:space="preserve">Go back to the app — the overlay is still showing</w:t>
+      </w:r>
+    </w:p>
+    <w:p>
+      <w:pPr>
+        <w:pStyle w:val="Compact"/>
+        <w:numPr>
+          <w:ilvl w:val="1"/>
+          <w:numId w:val="1022"/>
+        </w:numPr>
+      </w:pPr>
+      <w:r>
+        <w:t xml:space="preserve">Tap</w:t>
+      </w:r>
+      <w:r>
+        <w:t xml:space="preserve"> </w:t>
+      </w:r>
+      <w:r>
+        <w:rPr>
+          <w:b/>
+          <w:bCs/>
+        </w:rPr>
+        <w:t xml:space="preserve">“Next →”</w:t>
+      </w:r>
+      <w:r>
+        <w:t xml:space="preserve"> </w:t>
+      </w:r>
+      <w:r>
+        <w:t xml:space="preserve">to open the next session in Safari</w:t>
+      </w:r>
+    </w:p>
+    <w:p>
+      <w:pPr>
+        <w:pStyle w:val="Compact"/>
+        <w:numPr>
+          <w:ilvl w:val="1"/>
+          <w:numId w:val="1022"/>
+        </w:numPr>
+      </w:pPr>
+      <w:r>
+        <w:t xml:space="preserve">Repeat until all sessions are saved</w:t>
+      </w:r>
+    </w:p>
+    <w:p>
+      <w:pPr>
+        <w:pStyle w:val="Compact"/>
+        <w:numPr>
+          <w:ilvl w:val="1"/>
+          <w:numId w:val="1022"/>
+        </w:numPr>
+      </w:pPr>
+      <w:r>
+        <w:t xml:space="preserve">Tap</w:t>
+      </w:r>
+      <w:r>
+        <w:t xml:space="preserve"> </w:t>
+      </w:r>
+      <w:r>
+        <w:rPr>
+          <w:b/>
+          <w:bCs/>
+        </w:rPr>
+        <w:t xml:space="preserve">“Done”</w:t>
+      </w:r>
+      <w:r>
+        <w:t xml:space="preserve"> </w:t>
+      </w:r>
+      <w:r>
+        <w:t xml:space="preserve">on the last session, or</w:t>
+      </w:r>
+      <w:r>
+        <w:t xml:space="preserve"> </w:t>
+      </w:r>
+      <w:r>
+        <w:rPr>
+          <w:b/>
+          <w:bCs/>
+        </w:rPr>
+        <w:t xml:space="preserve">“Stop”</w:t>
+      </w:r>
+      <w:r>
+        <w:t xml:space="preserve"> </w:t>
+      </w:r>
+      <w:r>
+        <w:t xml:space="preserve">to exit early</w:t>
+      </w:r>
+    </w:p>
+    <w:p>
+      <w:pPr>
+        <w:pStyle w:val="Compact"/>
+        <w:numPr>
+          <w:ilvl w:val="0"/>
+          <w:numId w:val="1019"/>
+        </w:numPr>
+      </w:pPr>
+      <w:r>
+        <w:rPr>
+          <w:b/>
+          <w:bCs/>
+        </w:rPr>
         <w:t xml:space="preserve">Check Calendar App:</w:t>
       </w:r>
     </w:p>
@@ -2980,7 +3086,7 @@
         <w:pStyle w:val="Compact"/>
         <w:numPr>
           <w:ilvl w:val="1"/>
-          <w:numId w:val="1022"/>
+          <w:numId w:val="1023"/>
         </w:numPr>
       </w:pPr>
       <w:r>
@@ -2992,7 +3098,7 @@
         <w:pStyle w:val="Compact"/>
         <w:numPr>
           <w:ilvl w:val="1"/>
-          <w:numId w:val="1022"/>
+          <w:numId w:val="1023"/>
         </w:numPr>
       </w:pPr>
       <w:r>
@@ -3004,7 +3110,7 @@
         <w:pStyle w:val="Compact"/>
         <w:numPr>
           <w:ilvl w:val="1"/>
-          <w:numId w:val="1022"/>
+          <w:numId w:val="1023"/>
         </w:numPr>
       </w:pPr>
       <w:r>
@@ -3026,7 +3132,7 @@
         <w:pStyle w:val="Compact"/>
         <w:numPr>
           <w:ilvl w:val="0"/>
-          <w:numId w:val="1023"/>
+          <w:numId w:val="1024"/>
         </w:numPr>
       </w:pPr>
       <w:r>
@@ -3042,158 +3148,264 @@
         <w:pStyle w:val="Compact"/>
         <w:numPr>
           <w:ilvl w:val="1"/>
+          <w:numId w:val="1025"/>
+        </w:numPr>
+      </w:pPr>
+      <w:r>
+        <w:t xml:space="preserve">Go to</w:t>
+      </w:r>
+      <w:r>
+        <w:t xml:space="preserve"> </w:t>
+      </w:r>
+      <w:r>
+        <w:rPr>
+          <w:b/>
+          <w:bCs/>
+        </w:rPr>
+        <w:t xml:space="preserve">Schedule</w:t>
+      </w:r>
+      <w:r>
+        <w:t xml:space="preserve"> </w:t>
+      </w:r>
+      <w:r>
+        <w:t xml:space="preserve">tab</w:t>
+      </w:r>
+    </w:p>
+    <w:p>
+      <w:pPr>
+        <w:pStyle w:val="Compact"/>
+        <w:numPr>
+          <w:ilvl w:val="1"/>
+          <w:numId w:val="1025"/>
+        </w:numPr>
+      </w:pPr>
+      <w:r>
+        <w:t xml:space="preserve">Make sure sessions are selected</w:t>
+      </w:r>
+    </w:p>
+    <w:p>
+      <w:pPr>
+        <w:pStyle w:val="Compact"/>
+        <w:numPr>
+          <w:ilvl w:val="1"/>
+          <w:numId w:val="1025"/>
+        </w:numPr>
+      </w:pPr>
+      <w:r>
+        <w:t xml:space="preserve">Tap</w:t>
+      </w:r>
+      <w:r>
+        <w:t xml:space="preserve"> </w:t>
+      </w:r>
+      <w:r>
+        <w:rPr>
+          <w:b/>
+          <w:bCs/>
+        </w:rPr>
+        <w:t xml:space="preserve">“Google Calendar”</w:t>
+      </w:r>
+      <w:r>
+        <w:t xml:space="preserve"> </w:t>
+      </w:r>
+      <w:r>
+        <w:t xml:space="preserve">button</w:t>
+      </w:r>
+    </w:p>
+    <w:p>
+      <w:pPr>
+        <w:pStyle w:val="Compact"/>
+        <w:numPr>
+          <w:ilvl w:val="1"/>
+          <w:numId w:val="1025"/>
+        </w:numPr>
+      </w:pPr>
+      <w:r>
+        <w:t xml:space="preserve">An overlay appears showing</w:t>
+      </w:r>
+      <w:r>
+        <w:t xml:space="preserve"> </w:t>
+      </w:r>
+      <w:r>
+        <w:t xml:space="preserve">“Session 1 of N”</w:t>
+      </w:r>
+    </w:p>
+    <w:p>
+      <w:pPr>
+        <w:pStyle w:val="Compact"/>
+        <w:numPr>
+          <w:ilvl w:val="0"/>
           <w:numId w:val="1024"/>
         </w:numPr>
       </w:pPr>
       <w:r>
-        <w:t xml:space="preserve">Go to</w:t>
-      </w:r>
-      <w:r>
-        <w:t xml:space="preserve"> </w:t>
-      </w:r>
-      <w:r>
-        <w:rPr>
-          <w:b/>
-          <w:bCs/>
-        </w:rPr>
-        <w:t xml:space="preserve">Schedule</w:t>
-      </w:r>
-      <w:r>
-        <w:t xml:space="preserve"> </w:t>
-      </w:r>
-      <w:r>
-        <w:t xml:space="preserve">tab</w:t>
-      </w:r>
-    </w:p>
-    <w:p>
-      <w:pPr>
-        <w:pStyle w:val="Compact"/>
-        <w:numPr>
-          <w:ilvl w:val="1"/>
+        <w:rPr>
+          <w:b/>
+          <w:bCs/>
+        </w:rPr>
+        <w:t xml:space="preserve">In Chrome (Browser Opens):</w:t>
+      </w:r>
+    </w:p>
+    <w:p>
+      <w:pPr>
+        <w:pStyle w:val="Compact"/>
+        <w:numPr>
+          <w:ilvl w:val="1"/>
+          <w:numId w:val="1026"/>
+        </w:numPr>
+      </w:pPr>
+      <w:r>
+        <w:t xml:space="preserve">Google Calendar opens with the first session pre-filled</w:t>
+      </w:r>
+    </w:p>
+    <w:p>
+      <w:pPr>
+        <w:pStyle w:val="Compact"/>
+        <w:numPr>
+          <w:ilvl w:val="1"/>
+          <w:numId w:val="1026"/>
+        </w:numPr>
+      </w:pPr>
+      <w:r>
+        <w:t xml:space="preserve">Tap</w:t>
+      </w:r>
+      <w:r>
+        <w:t xml:space="preserve"> </w:t>
+      </w:r>
+      <w:r>
+        <w:rPr>
+          <w:b/>
+          <w:bCs/>
+        </w:rPr>
+        <w:t xml:space="preserve">“Save”</w:t>
+      </w:r>
+      <w:r>
+        <w:t xml:space="preserve"> </w:t>
+      </w:r>
+      <w:r>
+        <w:t xml:space="preserve">to add it to your calendar</w:t>
+      </w:r>
+    </w:p>
+    <w:p>
+      <w:pPr>
+        <w:pStyle w:val="Compact"/>
+        <w:numPr>
+          <w:ilvl w:val="0"/>
           <w:numId w:val="1024"/>
         </w:numPr>
       </w:pPr>
       <w:r>
-        <w:t xml:space="preserve">Make sure sessions are selected</w:t>
-      </w:r>
-    </w:p>
-    <w:p>
-      <w:pPr>
-        <w:pStyle w:val="Compact"/>
-        <w:numPr>
-          <w:ilvl w:val="1"/>
+        <w:rPr>
+          <w:b/>
+          <w:bCs/>
+        </w:rPr>
+        <w:t xml:space="preserve">Return to App:</w:t>
+      </w:r>
+    </w:p>
+    <w:p>
+      <w:pPr>
+        <w:pStyle w:val="Compact"/>
+        <w:numPr>
+          <w:ilvl w:val="1"/>
+          <w:numId w:val="1027"/>
+        </w:numPr>
+      </w:pPr>
+      <w:r>
+        <w:t xml:space="preserve">Use the back button or task switcher to return to the app</w:t>
+      </w:r>
+    </w:p>
+    <w:p>
+      <w:pPr>
+        <w:pStyle w:val="Compact"/>
+        <w:numPr>
+          <w:ilvl w:val="1"/>
+          <w:numId w:val="1027"/>
+        </w:numPr>
+      </w:pPr>
+      <w:r>
+        <w:t xml:space="preserve">The overlay is still showing — tap</w:t>
+      </w:r>
+      <w:r>
+        <w:t xml:space="preserve"> </w:t>
+      </w:r>
+      <w:r>
+        <w:rPr>
+          <w:b/>
+          <w:bCs/>
+        </w:rPr>
+        <w:t xml:space="preserve">“Next →”</w:t>
+      </w:r>
+      <w:r>
+        <w:t xml:space="preserve"> </w:t>
+      </w:r>
+      <w:r>
+        <w:t xml:space="preserve">to open the next session</w:t>
+      </w:r>
+    </w:p>
+    <w:p>
+      <w:pPr>
+        <w:pStyle w:val="Compact"/>
+        <w:numPr>
+          <w:ilvl w:val="1"/>
+          <w:numId w:val="1027"/>
+        </w:numPr>
+      </w:pPr>
+      <w:r>
+        <w:t xml:space="preserve">Repeat until all sessions are saved</w:t>
+      </w:r>
+    </w:p>
+    <w:p>
+      <w:pPr>
+        <w:pStyle w:val="Compact"/>
+        <w:numPr>
+          <w:ilvl w:val="1"/>
+          <w:numId w:val="1027"/>
+        </w:numPr>
+      </w:pPr>
+      <w:r>
+        <w:t xml:space="preserve">Tap</w:t>
+      </w:r>
+      <w:r>
+        <w:t xml:space="preserve"> </w:t>
+      </w:r>
+      <w:r>
+        <w:rPr>
+          <w:b/>
+          <w:bCs/>
+        </w:rPr>
+        <w:t xml:space="preserve">“Done”</w:t>
+      </w:r>
+      <w:r>
+        <w:t xml:space="preserve"> </w:t>
+      </w:r>
+      <w:r>
+        <w:t xml:space="preserve">on the last session, or</w:t>
+      </w:r>
+      <w:r>
+        <w:t xml:space="preserve"> </w:t>
+      </w:r>
+      <w:r>
+        <w:rPr>
+          <w:b/>
+          <w:bCs/>
+        </w:rPr>
+        <w:t xml:space="preserve">“Stop”</w:t>
+      </w:r>
+      <w:r>
+        <w:t xml:space="preserve"> </w:t>
+      </w:r>
+      <w:r>
+        <w:t xml:space="preserve">to exit early</w:t>
+      </w:r>
+    </w:p>
+    <w:p>
+      <w:pPr>
+        <w:pStyle w:val="Compact"/>
+        <w:numPr>
+          <w:ilvl w:val="0"/>
           <w:numId w:val="1024"/>
         </w:numPr>
       </w:pPr>
       <w:r>
-        <w:t xml:space="preserve">Tap</w:t>
-      </w:r>
-      <w:r>
-        <w:t xml:space="preserve"> </w:t>
-      </w:r>
-      <w:r>
-        <w:rPr>
-          <w:b/>
-          <w:bCs/>
-        </w:rPr>
-        <w:t xml:space="preserve">“📅 Google Calendar”</w:t>
-      </w:r>
-      <w:r>
-        <w:t xml:space="preserve"> </w:t>
-      </w:r>
-      <w:r>
-        <w:t xml:space="preserve">button</w:t>
-      </w:r>
-    </w:p>
-    <w:p>
-      <w:pPr>
-        <w:pStyle w:val="Compact"/>
-        <w:numPr>
-          <w:ilvl w:val="0"/>
-          <w:numId w:val="1023"/>
-        </w:numPr>
-      </w:pPr>
-      <w:r>
-        <w:rPr>
-          <w:b/>
-          <w:bCs/>
-        </w:rPr>
-        <w:t xml:space="preserve">In Chrome (Browser Opens):</w:t>
-      </w:r>
-    </w:p>
-    <w:p>
-      <w:pPr>
-        <w:pStyle w:val="Compact"/>
-        <w:numPr>
-          <w:ilvl w:val="1"/>
-          <w:numId w:val="1025"/>
-        </w:numPr>
-      </w:pPr>
-      <w:r>
-        <w:t xml:space="preserve">Google Calendar opens automatically</w:t>
-      </w:r>
-    </w:p>
-    <w:p>
-      <w:pPr>
-        <w:pStyle w:val="Compact"/>
-        <w:numPr>
-          <w:ilvl w:val="1"/>
-          <w:numId w:val="1025"/>
-        </w:numPr>
-      </w:pPr>
-      <w:r>
-        <w:t xml:space="preserve">Each session opens as a new event</w:t>
-      </w:r>
-    </w:p>
-    <w:p>
-      <w:pPr>
-        <w:pStyle w:val="Compact"/>
-        <w:numPr>
-          <w:ilvl w:val="1"/>
-          <w:numId w:val="1025"/>
-        </w:numPr>
-      </w:pPr>
-      <w:r>
-        <w:t xml:space="preserve">Tap</w:t>
-      </w:r>
-      <w:r>
-        <w:t xml:space="preserve"> </w:t>
-      </w:r>
-      <w:r>
-        <w:rPr>
-          <w:b/>
-          <w:bCs/>
-        </w:rPr>
-        <w:t xml:space="preserve">“Save”</w:t>
-      </w:r>
-      <w:r>
-        <w:t xml:space="preserve"> </w:t>
-      </w:r>
-      <w:r>
-        <w:t xml:space="preserve">to add to your calendar</w:t>
-      </w:r>
-    </w:p>
-    <w:p>
-      <w:pPr>
-        <w:pStyle w:val="Compact"/>
-        <w:numPr>
-          <w:ilvl w:val="1"/>
-          <w:numId w:val="1025"/>
-        </w:numPr>
-      </w:pPr>
-      <w:r>
-        <w:t xml:space="preserve">Repeat for each session</w:t>
-      </w:r>
-    </w:p>
-    <w:p>
-      <w:pPr>
-        <w:pStyle w:val="Compact"/>
-        <w:numPr>
-          <w:ilvl w:val="0"/>
-          <w:numId w:val="1023"/>
-        </w:numPr>
-      </w:pPr>
-      <w:r>
         <w:rPr>
           <w:b/>
           <w:bCs/>
@@ -3206,7 +3418,7 @@
         <w:pStyle w:val="Compact"/>
         <w:numPr>
           <w:ilvl w:val="1"/>
-          <w:numId w:val="1026"/>
+          <w:numId w:val="1028"/>
         </w:numPr>
       </w:pPr>
       <w:r>
@@ -3218,7 +3430,7 @@
         <w:pStyle w:val="Compact"/>
         <w:numPr>
           <w:ilvl w:val="1"/>
-          <w:numId w:val="1026"/>
+          <w:numId w:val="1028"/>
         </w:numPr>
       </w:pPr>
       <w:r>
@@ -3230,7 +3442,7 @@
         <w:pStyle w:val="Compact"/>
         <w:numPr>
           <w:ilvl w:val="1"/>
-          <w:numId w:val="1026"/>
+          <w:numId w:val="1028"/>
         </w:numPr>
       </w:pPr>
       <w:r>
@@ -3262,7 +3474,7 @@
         <w:pStyle w:val="Compact"/>
         <w:numPr>
           <w:ilvl w:val="0"/>
-          <w:numId w:val="1027"/>
+          <w:numId w:val="1029"/>
         </w:numPr>
       </w:pPr>
       <w:r>
@@ -3278,7 +3490,7 @@
         <w:pStyle w:val="Compact"/>
         <w:numPr>
           <w:ilvl w:val="1"/>
-          <w:numId w:val="1028"/>
+          <w:numId w:val="1030"/>
         </w:numPr>
       </w:pPr>
       <w:r>
@@ -3306,7 +3518,7 @@
         <w:pStyle w:val="Compact"/>
         <w:numPr>
           <w:ilvl w:val="1"/>
-          <w:numId w:val="1028"/>
+          <w:numId w:val="1030"/>
         </w:numPr>
       </w:pPr>
       <w:r>
@@ -3318,7 +3530,7 @@
         <w:pStyle w:val="Compact"/>
         <w:numPr>
           <w:ilvl w:val="1"/>
-          <w:numId w:val="1028"/>
+          <w:numId w:val="1030"/>
         </w:numPr>
       </w:pPr>
       <w:r>
@@ -3346,7 +3558,7 @@
         <w:pStyle w:val="Compact"/>
         <w:numPr>
           <w:ilvl w:val="0"/>
-          <w:numId w:val="1027"/>
+          <w:numId w:val="1029"/>
         </w:numPr>
       </w:pPr>
       <w:r>
@@ -3362,11 +3574,110 @@
         <w:pStyle w:val="Compact"/>
         <w:numPr>
           <w:ilvl w:val="1"/>
+          <w:numId w:val="1031"/>
+        </w:numPr>
+      </w:pPr>
+      <w:r>
+        <w:rPr>
+          <w:rStyle w:val="VerbatimChar"/>
+        </w:rPr>
+        <w:t xml:space="preserve">.ics</w:t>
+      </w:r>
+      <w:r>
+        <w:t xml:space="preserve"> </w:t>
+      </w:r>
+      <w:r>
+        <w:t xml:space="preserve">file downloads automatically</w:t>
+      </w:r>
+    </w:p>
+    <w:p>
+      <w:pPr>
+        <w:pStyle w:val="Compact"/>
+        <w:numPr>
+          <w:ilvl w:val="1"/>
+          <w:numId w:val="1031"/>
+        </w:numPr>
+      </w:pPr>
+      <w:r>
+        <w:t xml:space="preserve">You’ll see a download notification</w:t>
+      </w:r>
+    </w:p>
+    <w:p>
+      <w:pPr>
+        <w:pStyle w:val="Compact"/>
+        <w:numPr>
+          <w:ilvl w:val="0"/>
           <w:numId w:val="1029"/>
         </w:numPr>
       </w:pPr>
       <w:r>
         <w:rPr>
+          <w:b/>
+          <w:bCs/>
+        </w:rPr>
+        <w:t xml:space="preserve">In Calendar App:</w:t>
+      </w:r>
+    </w:p>
+    <w:p>
+      <w:pPr>
+        <w:pStyle w:val="Compact"/>
+        <w:numPr>
+          <w:ilvl w:val="1"/>
+          <w:numId w:val="1032"/>
+        </w:numPr>
+      </w:pPr>
+      <w:r>
+        <w:t xml:space="preserve">Open</w:t>
+      </w:r>
+      <w:r>
+        <w:t xml:space="preserve"> </w:t>
+      </w:r>
+      <w:r>
+        <w:rPr>
+          <w:b/>
+          <w:bCs/>
+        </w:rPr>
+        <w:t xml:space="preserve">Mail</w:t>
+      </w:r>
+      <w:r>
+        <w:t xml:space="preserve"> </w:t>
+      </w:r>
+      <w:r>
+        <w:t xml:space="preserve">app or</w:t>
+      </w:r>
+      <w:r>
+        <w:t xml:space="preserve"> </w:t>
+      </w:r>
+      <w:r>
+        <w:rPr>
+          <w:b/>
+          <w:bCs/>
+        </w:rPr>
+        <w:t xml:space="preserve">Files</w:t>
+      </w:r>
+      <w:r>
+        <w:t xml:space="preserve"> </w:t>
+      </w:r>
+      <w:r>
+        <w:t xml:space="preserve">app</w:t>
+      </w:r>
+    </w:p>
+    <w:p>
+      <w:pPr>
+        <w:pStyle w:val="Compact"/>
+        <w:numPr>
+          <w:ilvl w:val="1"/>
+          <w:numId w:val="1032"/>
+        </w:numPr>
+      </w:pPr>
+      <w:r>
+        <w:t xml:space="preserve">Find the downloaded</w:t>
+      </w:r>
+      <w:r>
+        <w:t xml:space="preserve"> </w:t>
+      </w:r>
+      <w:r>
+        <w:rPr>
           <w:rStyle w:val="VerbatimChar"/>
         </w:rPr>
         <w:t xml:space="preserve">.ics</w:t>
@@ -3375,185 +3686,86 @@
         <w:t xml:space="preserve"> </w:t>
       </w:r>
       <w:r>
-        <w:t xml:space="preserve">file downloads automatically</w:t>
-      </w:r>
-    </w:p>
-    <w:p>
-      <w:pPr>
-        <w:pStyle w:val="Compact"/>
-        <w:numPr>
-          <w:ilvl w:val="1"/>
+        <w:t xml:space="preserve">file</w:t>
+      </w:r>
+    </w:p>
+    <w:p>
+      <w:pPr>
+        <w:pStyle w:val="Compact"/>
+        <w:numPr>
+          <w:ilvl w:val="1"/>
+          <w:numId w:val="1032"/>
+        </w:numPr>
+      </w:pPr>
+      <w:r>
+        <w:t xml:space="preserve">Tap the file</w:t>
+      </w:r>
+    </w:p>
+    <w:p>
+      <w:pPr>
+        <w:pStyle w:val="Compact"/>
+        <w:numPr>
+          <w:ilvl w:val="1"/>
+          <w:numId w:val="1032"/>
+        </w:numPr>
+      </w:pPr>
+      <w:r>
+        <w:t xml:space="preserve">Tap</w:t>
+      </w:r>
+      <w:r>
+        <w:t xml:space="preserve"> </w:t>
+      </w:r>
+      <w:r>
+        <w:rPr>
+          <w:b/>
+          <w:bCs/>
+        </w:rPr>
+        <w:t xml:space="preserve">“Add to Calendar”</w:t>
+      </w:r>
+    </w:p>
+    <w:p>
+      <w:pPr>
+        <w:pStyle w:val="Compact"/>
+        <w:numPr>
+          <w:ilvl w:val="1"/>
+          <w:numId w:val="1032"/>
+        </w:numPr>
+      </w:pPr>
+      <w:r>
+        <w:t xml:space="preserve">Select which calendar to add to</w:t>
+      </w:r>
+    </w:p>
+    <w:p>
+      <w:pPr>
+        <w:pStyle w:val="Compact"/>
+        <w:numPr>
+          <w:ilvl w:val="1"/>
+          <w:numId w:val="1032"/>
+        </w:numPr>
+      </w:pPr>
+      <w:r>
+        <w:t xml:space="preserve">Tap</w:t>
+      </w:r>
+      <w:r>
+        <w:t xml:space="preserve"> </w:t>
+      </w:r>
+      <w:r>
+        <w:rPr>
+          <w:b/>
+          <w:bCs/>
+        </w:rPr>
+        <w:t xml:space="preserve">“Add”</w:t>
+      </w:r>
+    </w:p>
+    <w:p>
+      <w:pPr>
+        <w:pStyle w:val="Compact"/>
+        <w:numPr>
+          <w:ilvl w:val="0"/>
           <w:numId w:val="1029"/>
         </w:numPr>
       </w:pPr>
       <w:r>
-        <w:t xml:space="preserve">You’ll see a download notification</w:t>
-      </w:r>
-    </w:p>
-    <w:p>
-      <w:pPr>
-        <w:pStyle w:val="Compact"/>
-        <w:numPr>
-          <w:ilvl w:val="0"/>
-          <w:numId w:val="1027"/>
-        </w:numPr>
-      </w:pPr>
-      <w:r>
-        <w:rPr>
-          <w:b/>
-          <w:bCs/>
-        </w:rPr>
-        <w:t xml:space="preserve">In Calendar App:</w:t>
-      </w:r>
-    </w:p>
-    <w:p>
-      <w:pPr>
-        <w:pStyle w:val="Compact"/>
-        <w:numPr>
-          <w:ilvl w:val="1"/>
-          <w:numId w:val="1030"/>
-        </w:numPr>
-      </w:pPr>
-      <w:r>
-        <w:t xml:space="preserve">Open</w:t>
-      </w:r>
-      <w:r>
-        <w:t xml:space="preserve"> </w:t>
-      </w:r>
-      <w:r>
-        <w:rPr>
-          <w:b/>
-          <w:bCs/>
-        </w:rPr>
-        <w:t xml:space="preserve">Mail</w:t>
-      </w:r>
-      <w:r>
-        <w:t xml:space="preserve"> </w:t>
-      </w:r>
-      <w:r>
-        <w:t xml:space="preserve">app or</w:t>
-      </w:r>
-      <w:r>
-        <w:t xml:space="preserve"> </w:t>
-      </w:r>
-      <w:r>
-        <w:rPr>
-          <w:b/>
-          <w:bCs/>
-        </w:rPr>
-        <w:t xml:space="preserve">Files</w:t>
-      </w:r>
-      <w:r>
-        <w:t xml:space="preserve"> </w:t>
-      </w:r>
-      <w:r>
-        <w:t xml:space="preserve">app</w:t>
-      </w:r>
-    </w:p>
-    <w:p>
-      <w:pPr>
-        <w:pStyle w:val="Compact"/>
-        <w:numPr>
-          <w:ilvl w:val="1"/>
-          <w:numId w:val="1030"/>
-        </w:numPr>
-      </w:pPr>
-      <w:r>
-        <w:t xml:space="preserve">Find the downloaded</w:t>
-      </w:r>
-      <w:r>
-        <w:t xml:space="preserve"> </w:t>
-      </w:r>
-      <w:r>
-        <w:rPr>
-          <w:rStyle w:val="VerbatimChar"/>
-        </w:rPr>
-        <w:t xml:space="preserve">.ics</w:t>
-      </w:r>
-      <w:r>
-        <w:t xml:space="preserve"> </w:t>
-      </w:r>
-      <w:r>
-        <w:t xml:space="preserve">file</w:t>
-      </w:r>
-    </w:p>
-    <w:p>
-      <w:pPr>
-        <w:pStyle w:val="Compact"/>
-        <w:numPr>
-          <w:ilvl w:val="1"/>
-          <w:numId w:val="1030"/>
-        </w:numPr>
-      </w:pPr>
-      <w:r>
-        <w:t xml:space="preserve">Tap the file</w:t>
-      </w:r>
-    </w:p>
-    <w:p>
-      <w:pPr>
-        <w:pStyle w:val="Compact"/>
-        <w:numPr>
-          <w:ilvl w:val="1"/>
-          <w:numId w:val="1030"/>
-        </w:numPr>
-      </w:pPr>
-      <w:r>
-        <w:t xml:space="preserve">Tap</w:t>
-      </w:r>
-      <w:r>
-        <w:t xml:space="preserve"> </w:t>
-      </w:r>
-      <w:r>
-        <w:rPr>
-          <w:b/>
-          <w:bCs/>
-        </w:rPr>
-        <w:t xml:space="preserve">“Add to Calendar”</w:t>
-      </w:r>
-    </w:p>
-    <w:p>
-      <w:pPr>
-        <w:pStyle w:val="Compact"/>
-        <w:numPr>
-          <w:ilvl w:val="1"/>
-          <w:numId w:val="1030"/>
-        </w:numPr>
-      </w:pPr>
-      <w:r>
-        <w:t xml:space="preserve">Select which calendar to add to</w:t>
-      </w:r>
-    </w:p>
-    <w:p>
-      <w:pPr>
-        <w:pStyle w:val="Compact"/>
-        <w:numPr>
-          <w:ilvl w:val="1"/>
-          <w:numId w:val="1030"/>
-        </w:numPr>
-      </w:pPr>
-      <w:r>
-        <w:t xml:space="preserve">Tap</w:t>
-      </w:r>
-      <w:r>
-        <w:t xml:space="preserve"> </w:t>
-      </w:r>
-      <w:r>
-        <w:rPr>
-          <w:b/>
-          <w:bCs/>
-        </w:rPr>
-        <w:t xml:space="preserve">“Add”</w:t>
-      </w:r>
-    </w:p>
-    <w:p>
-      <w:pPr>
-        <w:pStyle w:val="Compact"/>
-        <w:numPr>
-          <w:ilvl w:val="0"/>
-          <w:numId w:val="1027"/>
-        </w:numPr>
-      </w:pPr>
-      <w:r>
         <w:rPr>
           <w:b/>
           <w:bCs/>
@@ -3566,7 +3778,7 @@
         <w:pStyle w:val="Compact"/>
         <w:numPr>
           <w:ilvl w:val="1"/>
-          <w:numId w:val="1031"/>
+          <w:numId w:val="1033"/>
         </w:numPr>
       </w:pPr>
       <w:r>
@@ -3578,7 +3790,7 @@
         <w:pStyle w:val="Compact"/>
         <w:numPr>
           <w:ilvl w:val="1"/>
-          <w:numId w:val="1031"/>
+          <w:numId w:val="1033"/>
         </w:numPr>
       </w:pPr>
       <w:r>
@@ -3590,7 +3802,7 @@
         <w:pStyle w:val="Compact"/>
         <w:numPr>
           <w:ilvl w:val="1"/>
-          <w:numId w:val="1031"/>
+          <w:numId w:val="1033"/>
         </w:numPr>
       </w:pPr>
       <w:r>
@@ -3612,7 +3824,7 @@
         <w:pStyle w:val="Compact"/>
         <w:numPr>
           <w:ilvl w:val="0"/>
-          <w:numId w:val="1032"/>
+          <w:numId w:val="1034"/>
         </w:numPr>
       </w:pPr>
       <w:r>
@@ -3628,7 +3840,7 @@
         <w:pStyle w:val="Compact"/>
         <w:numPr>
           <w:ilvl w:val="1"/>
-          <w:numId w:val="1033"/>
+          <w:numId w:val="1035"/>
         </w:numPr>
       </w:pPr>
       <w:r>
@@ -3656,7 +3868,7 @@
         <w:pStyle w:val="Compact"/>
         <w:numPr>
           <w:ilvl w:val="1"/>
-          <w:numId w:val="1033"/>
+          <w:numId w:val="1035"/>
         </w:numPr>
       </w:pPr>
       <w:r>
@@ -3684,7 +3896,7 @@
         <w:pStyle w:val="Compact"/>
         <w:numPr>
           <w:ilvl w:val="0"/>
-          <w:numId w:val="1032"/>
+          <w:numId w:val="1034"/>
         </w:numPr>
       </w:pPr>
       <w:r>
@@ -3700,11 +3912,66 @@
         <w:pStyle w:val="Compact"/>
         <w:numPr>
           <w:ilvl w:val="1"/>
+          <w:numId w:val="1036"/>
+        </w:numPr>
+      </w:pPr>
+      <w:r>
+        <w:rPr>
+          <w:rStyle w:val="VerbatimChar"/>
+        </w:rPr>
+        <w:t xml:space="preserve">.ics</w:t>
+      </w:r>
+      <w:r>
+        <w:t xml:space="preserve"> </w:t>
+      </w:r>
+      <w:r>
+        <w:t xml:space="preserve">file downloads to Downloads folder</w:t>
+      </w:r>
+    </w:p>
+    <w:p>
+      <w:pPr>
+        <w:pStyle w:val="Compact"/>
+        <w:numPr>
+          <w:ilvl w:val="0"/>
           <w:numId w:val="1034"/>
         </w:numPr>
       </w:pPr>
       <w:r>
         <w:rPr>
+          <w:b/>
+          <w:bCs/>
+        </w:rPr>
+        <w:t xml:space="preserve">Import to Calendar:</w:t>
+      </w:r>
+    </w:p>
+    <w:p>
+      <w:pPr>
+        <w:pStyle w:val="Compact"/>
+        <w:numPr>
+          <w:ilvl w:val="1"/>
+          <w:numId w:val="1037"/>
+        </w:numPr>
+      </w:pPr>
+      <w:r>
+        <w:t xml:space="preserve">Finder → Downloads</w:t>
+      </w:r>
+    </w:p>
+    <w:p>
+      <w:pPr>
+        <w:pStyle w:val="Compact"/>
+        <w:numPr>
+          <w:ilvl w:val="1"/>
+          <w:numId w:val="1037"/>
+        </w:numPr>
+      </w:pPr>
+      <w:r>
+        <w:t xml:space="preserve">Double-click the</w:t>
+      </w:r>
+      <w:r>
+        <w:t xml:space="preserve"> </w:t>
+      </w:r>
+      <w:r>
+        <w:rPr>
           <w:rStyle w:val="VerbatimChar"/>
         </w:rPr>
         <w:t xml:space="preserve">.ics</w:t>
@@ -3713,61 +3980,6 @@
         <w:t xml:space="preserve"> </w:t>
       </w:r>
       <w:r>
-        <w:t xml:space="preserve">file downloads to Downloads folder</w:t>
-      </w:r>
-    </w:p>
-    <w:p>
-      <w:pPr>
-        <w:pStyle w:val="Compact"/>
-        <w:numPr>
-          <w:ilvl w:val="0"/>
-          <w:numId w:val="1032"/>
-        </w:numPr>
-      </w:pPr>
-      <w:r>
-        <w:rPr>
-          <w:b/>
-          <w:bCs/>
-        </w:rPr>
-        <w:t xml:space="preserve">Import to Calendar:</w:t>
-      </w:r>
-    </w:p>
-    <w:p>
-      <w:pPr>
-        <w:pStyle w:val="Compact"/>
-        <w:numPr>
-          <w:ilvl w:val="1"/>
-          <w:numId w:val="1035"/>
-        </w:numPr>
-      </w:pPr>
-      <w:r>
-        <w:t xml:space="preserve">Finder → Downloads</w:t>
-      </w:r>
-    </w:p>
-    <w:p>
-      <w:pPr>
-        <w:pStyle w:val="Compact"/>
-        <w:numPr>
-          <w:ilvl w:val="1"/>
-          <w:numId w:val="1035"/>
-        </w:numPr>
-      </w:pPr>
-      <w:r>
-        <w:t xml:space="preserve">Double-click the</w:t>
-      </w:r>
-      <w:r>
-        <w:t xml:space="preserve"> </w:t>
-      </w:r>
-      <w:r>
-        <w:rPr>
-          <w:rStyle w:val="VerbatimChar"/>
-        </w:rPr>
-        <w:t xml:space="preserve">.ics</w:t>
-      </w:r>
-      <w:r>
-        <w:t xml:space="preserve"> </w:t>
-      </w:r>
-      <w:r>
         <w:t xml:space="preserve">file</w:t>
       </w:r>
     </w:p>
@@ -3776,7 +3988,7 @@
         <w:pStyle w:val="Compact"/>
         <w:numPr>
           <w:ilvl w:val="1"/>
-          <w:numId w:val="1035"/>
+          <w:numId w:val="1037"/>
         </w:numPr>
       </w:pPr>
       <w:r>
@@ -3788,7 +4000,7 @@
         <w:pStyle w:val="Compact"/>
         <w:numPr>
           <w:ilvl w:val="1"/>
-          <w:numId w:val="1035"/>
+          <w:numId w:val="1037"/>
         </w:numPr>
       </w:pPr>
       <w:r>
@@ -3810,7 +4022,7 @@
         <w:pStyle w:val="Compact"/>
         <w:numPr>
           <w:ilvl w:val="1"/>
-          <w:numId w:val="1035"/>
+          <w:numId w:val="1037"/>
         </w:numPr>
       </w:pPr>
       <w:r>
@@ -3822,7 +4034,7 @@
         <w:pStyle w:val="Compact"/>
         <w:numPr>
           <w:ilvl w:val="1"/>
-          <w:numId w:val="1035"/>
+          <w:numId w:val="1037"/>
         </w:numPr>
       </w:pPr>
       <w:r>
@@ -3922,7 +4134,7 @@
         <w:pStyle w:val="Compact"/>
         <w:numPr>
           <w:ilvl w:val="0"/>
-          <w:numId w:val="1036"/>
+          <w:numId w:val="1038"/>
         </w:numPr>
       </w:pPr>
       <w:r>
@@ -3938,7 +4150,7 @@
         <w:pStyle w:val="Compact"/>
         <w:numPr>
           <w:ilvl w:val="1"/>
-          <w:numId w:val="1037"/>
+          <w:numId w:val="1039"/>
         </w:numPr>
       </w:pPr>
       <w:r>
@@ -3966,7 +4178,7 @@
         <w:pStyle w:val="Compact"/>
         <w:numPr>
           <w:ilvl w:val="1"/>
-          <w:numId w:val="1037"/>
+          <w:numId w:val="1039"/>
         </w:numPr>
       </w:pPr>
       <w:r>
@@ -3994,7 +4206,7 @@
         <w:pStyle w:val="Compact"/>
         <w:numPr>
           <w:ilvl w:val="0"/>
-          <w:numId w:val="1036"/>
+          <w:numId w:val="1038"/>
         </w:numPr>
       </w:pPr>
       <w:r>
@@ -4010,11 +4222,78 @@
         <w:pStyle w:val="Compact"/>
         <w:numPr>
           <w:ilvl w:val="1"/>
+          <w:numId w:val="1040"/>
+        </w:numPr>
+      </w:pPr>
+      <w:r>
+        <w:rPr>
+          <w:rStyle w:val="VerbatimChar"/>
+        </w:rPr>
+        <w:t xml:space="preserve">.ics</w:t>
+      </w:r>
+      <w:r>
+        <w:t xml:space="preserve"> </w:t>
+      </w:r>
+      <w:r>
+        <w:t xml:space="preserve">file downloads to Downloads folder</w:t>
+      </w:r>
+    </w:p>
+    <w:p>
+      <w:pPr>
+        <w:pStyle w:val="Compact"/>
+        <w:numPr>
+          <w:ilvl w:val="0"/>
           <w:numId w:val="1038"/>
         </w:numPr>
       </w:pPr>
       <w:r>
         <w:rPr>
+          <w:b/>
+          <w:bCs/>
+        </w:rPr>
+        <w:t xml:space="preserve">Import to Your Calendar App:</w:t>
+      </w:r>
+    </w:p>
+    <w:p>
+      <w:pPr>
+        <w:pStyle w:val="Compact"/>
+        <w:numPr>
+          <w:ilvl w:val="1"/>
+          <w:numId w:val="1041"/>
+        </w:numPr>
+      </w:pPr>
+      <w:r>
+        <w:t xml:space="preserve">Open your calendar app</w:t>
+      </w:r>
+    </w:p>
+    <w:p>
+      <w:pPr>
+        <w:pStyle w:val="Compact"/>
+        <w:numPr>
+          <w:ilvl w:val="1"/>
+          <w:numId w:val="1041"/>
+        </w:numPr>
+      </w:pPr>
+      <w:r>
+        <w:t xml:space="preserve">Look for Import option</w:t>
+      </w:r>
+    </w:p>
+    <w:p>
+      <w:pPr>
+        <w:pStyle w:val="Compact"/>
+        <w:numPr>
+          <w:ilvl w:val="1"/>
+          <w:numId w:val="1041"/>
+        </w:numPr>
+      </w:pPr>
+      <w:r>
+        <w:t xml:space="preserve">Select the downloaded</w:t>
+      </w:r>
+      <w:r>
+        <w:t xml:space="preserve"> </w:t>
+      </w:r>
+      <w:r>
+        <w:rPr>
           <w:rStyle w:val="VerbatimChar"/>
         </w:rPr>
         <w:t xml:space="preserve">.ics</w:t>
@@ -4023,73 +4302,6 @@
         <w:t xml:space="preserve"> </w:t>
       </w:r>
       <w:r>
-        <w:t xml:space="preserve">file downloads to Downloads folder</w:t>
-      </w:r>
-    </w:p>
-    <w:p>
-      <w:pPr>
-        <w:pStyle w:val="Compact"/>
-        <w:numPr>
-          <w:ilvl w:val="0"/>
-          <w:numId w:val="1036"/>
-        </w:numPr>
-      </w:pPr>
-      <w:r>
-        <w:rPr>
-          <w:b/>
-          <w:bCs/>
-        </w:rPr>
-        <w:t xml:space="preserve">Import to Your Calendar App:</w:t>
-      </w:r>
-    </w:p>
-    <w:p>
-      <w:pPr>
-        <w:pStyle w:val="Compact"/>
-        <w:numPr>
-          <w:ilvl w:val="1"/>
-          <w:numId w:val="1039"/>
-        </w:numPr>
-      </w:pPr>
-      <w:r>
-        <w:t xml:space="preserve">Open your calendar app</w:t>
-      </w:r>
-    </w:p>
-    <w:p>
-      <w:pPr>
-        <w:pStyle w:val="Compact"/>
-        <w:numPr>
-          <w:ilvl w:val="1"/>
-          <w:numId w:val="1039"/>
-        </w:numPr>
-      </w:pPr>
-      <w:r>
-        <w:t xml:space="preserve">Look for Import option</w:t>
-      </w:r>
-    </w:p>
-    <w:p>
-      <w:pPr>
-        <w:pStyle w:val="Compact"/>
-        <w:numPr>
-          <w:ilvl w:val="1"/>
-          <w:numId w:val="1039"/>
-        </w:numPr>
-      </w:pPr>
-      <w:r>
-        <w:t xml:space="preserve">Select the downloaded</w:t>
-      </w:r>
-      <w:r>
-        <w:t xml:space="preserve"> </w:t>
-      </w:r>
-      <w:r>
-        <w:rPr>
-          <w:rStyle w:val="VerbatimChar"/>
-        </w:rPr>
-        <w:t xml:space="preserve">.ics</w:t>
-      </w:r>
-      <w:r>
-        <w:t xml:space="preserve"> </w:t>
-      </w:r>
-      <w:r>
         <w:t xml:space="preserve">file</w:t>
       </w:r>
     </w:p>
@@ -4098,7 +4310,7 @@
         <w:pStyle w:val="Compact"/>
         <w:numPr>
           <w:ilvl w:val="1"/>
-          <w:numId w:val="1039"/>
+          <w:numId w:val="1041"/>
         </w:numPr>
       </w:pPr>
       <w:r>
@@ -4361,7 +4573,7 @@
         <w:pStyle w:val="Compact"/>
         <w:numPr>
           <w:ilvl w:val="0"/>
-          <w:numId w:val="1040"/>
+          <w:numId w:val="1042"/>
         </w:numPr>
       </w:pPr>
       <w:r>
@@ -4377,7 +4589,7 @@
         <w:pStyle w:val="Compact"/>
         <w:numPr>
           <w:ilvl w:val="1"/>
-          <w:numId w:val="1041"/>
+          <w:numId w:val="1043"/>
         </w:numPr>
       </w:pPr>
       <w:r>
@@ -4389,7 +4601,7 @@
         <w:pStyle w:val="Compact"/>
         <w:numPr>
           <w:ilvl w:val="1"/>
-          <w:numId w:val="1041"/>
+          <w:numId w:val="1043"/>
         </w:numPr>
       </w:pPr>
       <w:r>
@@ -4401,7 +4613,7 @@
         <w:pStyle w:val="Compact"/>
         <w:numPr>
           <w:ilvl w:val="1"/>
-          <w:numId w:val="1041"/>
+          <w:numId w:val="1043"/>
         </w:numPr>
       </w:pPr>
       <w:r>
@@ -4413,7 +4625,7 @@
         <w:pStyle w:val="Compact"/>
         <w:numPr>
           <w:ilvl w:val="0"/>
-          <w:numId w:val="1040"/>
+          <w:numId w:val="1042"/>
         </w:numPr>
       </w:pPr>
       <w:r>
@@ -4429,34 +4641,34 @@
         <w:pStyle w:val="Compact"/>
         <w:numPr>
           <w:ilvl w:val="1"/>
+          <w:numId w:val="1044"/>
+        </w:numPr>
+      </w:pPr>
+      <w:r>
+        <w:t xml:space="preserve">iOS: Settings → General → iPhone Storage → VSS App → Offload App → Reinstall</w:t>
+      </w:r>
+    </w:p>
+    <w:p>
+      <w:pPr>
+        <w:pStyle w:val="Compact"/>
+        <w:numPr>
+          <w:ilvl w:val="1"/>
+          <w:numId w:val="1044"/>
+        </w:numPr>
+      </w:pPr>
+      <w:r>
+        <w:t xml:space="preserve">Android: Settings → Apps → VSS App → Storage → Clear Data</w:t>
+      </w:r>
+    </w:p>
+    <w:p>
+      <w:pPr>
+        <w:pStyle w:val="Compact"/>
+        <w:numPr>
+          <w:ilvl w:val="0"/>
           <w:numId w:val="1042"/>
         </w:numPr>
       </w:pPr>
       <w:r>
-        <w:t xml:space="preserve">iOS: Settings → General → iPhone Storage → VSS App → Offload App → Reinstall</w:t>
-      </w:r>
-    </w:p>
-    <w:p>
-      <w:pPr>
-        <w:pStyle w:val="Compact"/>
-        <w:numPr>
-          <w:ilvl w:val="1"/>
-          <w:numId w:val="1042"/>
-        </w:numPr>
-      </w:pPr>
-      <w:r>
-        <w:t xml:space="preserve">Android: Settings → Apps → VSS App → Storage → Clear Data</w:t>
-      </w:r>
-    </w:p>
-    <w:p>
-      <w:pPr>
-        <w:pStyle w:val="Compact"/>
-        <w:numPr>
-          <w:ilvl w:val="0"/>
-          <w:numId w:val="1040"/>
-        </w:numPr>
-      </w:pPr>
-      <w:r>
         <w:rPr>
           <w:b/>
           <w:bCs/>
@@ -4469,7 +4681,7 @@
         <w:pStyle w:val="Compact"/>
         <w:numPr>
           <w:ilvl w:val="1"/>
-          <w:numId w:val="1043"/>
+          <w:numId w:val="1045"/>
         </w:numPr>
       </w:pPr>
       <w:r>
@@ -4481,7 +4693,7 @@
         <w:pStyle w:val="Compact"/>
         <w:numPr>
           <w:ilvl w:val="1"/>
-          <w:numId w:val="1043"/>
+          <w:numId w:val="1045"/>
         </w:numPr>
       </w:pPr>
       <w:r>
@@ -4515,7 +4727,7 @@
         <w:pStyle w:val="Compact"/>
         <w:numPr>
           <w:ilvl w:val="0"/>
-          <w:numId w:val="1044"/>
+          <w:numId w:val="1046"/>
         </w:numPr>
       </w:pPr>
       <w:r>
@@ -4531,7 +4743,7 @@
         <w:pStyle w:val="Compact"/>
         <w:numPr>
           <w:ilvl w:val="1"/>
-          <w:numId w:val="1045"/>
+          <w:numId w:val="1047"/>
         </w:numPr>
       </w:pPr>
       <w:r>
@@ -4561,7 +4773,7 @@
         <w:pStyle w:val="Compact"/>
         <w:numPr>
           <w:ilvl w:val="1"/>
-          <w:numId w:val="1045"/>
+          <w:numId w:val="1047"/>
         </w:numPr>
       </w:pPr>
       <w:r>
@@ -4588,7 +4800,7 @@
         <w:pStyle w:val="Compact"/>
         <w:numPr>
           <w:ilvl w:val="1"/>
-          <w:numId w:val="1045"/>
+          <w:numId w:val="1047"/>
         </w:numPr>
       </w:pPr>
       <w:r>
@@ -4618,7 +4830,7 @@
         <w:pStyle w:val="Compact"/>
         <w:numPr>
           <w:ilvl w:val="0"/>
-          <w:numId w:val="1044"/>
+          <w:numId w:val="1046"/>
         </w:numPr>
       </w:pPr>
       <w:r>
@@ -4634,64 +4846,64 @@
         <w:pStyle w:val="Compact"/>
         <w:numPr>
           <w:ilvl w:val="1"/>
+          <w:numId w:val="1048"/>
+        </w:numPr>
+      </w:pPr>
+      <w:r>
+        <w:t xml:space="preserve">Make sure Day filter is not too restrictive</w:t>
+      </w:r>
+    </w:p>
+    <w:p>
+      <w:pPr>
+        <w:pStyle w:val="Compact"/>
+        <w:numPr>
+          <w:ilvl w:val="1"/>
+          <w:numId w:val="1048"/>
+        </w:numPr>
+      </w:pPr>
+      <w:r>
+        <w:t xml:space="preserve">Try</w:t>
+      </w:r>
+      <w:r>
+        <w:t xml:space="preserve"> </w:t>
+      </w:r>
+      <w:r>
+        <w:t xml:space="preserve">“All Days”</w:t>
+      </w:r>
+      <w:r>
+        <w:t xml:space="preserve"> </w:t>
+      </w:r>
+      <w:r>
+        <w:t xml:space="preserve">and</w:t>
+      </w:r>
+      <w:r>
+        <w:t xml:space="preserve"> </w:t>
+      </w:r>
+      <w:r>
+        <w:t xml:space="preserve">“All Types”</w:t>
+      </w:r>
+    </w:p>
+    <w:p>
+      <w:pPr>
+        <w:pStyle w:val="Compact"/>
+        <w:numPr>
+          <w:ilvl w:val="1"/>
+          <w:numId w:val="1048"/>
+        </w:numPr>
+      </w:pPr>
+      <w:r>
+        <w:t xml:space="preserve">Click search again</w:t>
+      </w:r>
+    </w:p>
+    <w:p>
+      <w:pPr>
+        <w:pStyle w:val="Compact"/>
+        <w:numPr>
+          <w:ilvl w:val="0"/>
           <w:numId w:val="1046"/>
         </w:numPr>
       </w:pPr>
       <w:r>
-        <w:t xml:space="preserve">Make sure Day filter is not too restrictive</w:t>
-      </w:r>
-    </w:p>
-    <w:p>
-      <w:pPr>
-        <w:pStyle w:val="Compact"/>
-        <w:numPr>
-          <w:ilvl w:val="1"/>
-          <w:numId w:val="1046"/>
-        </w:numPr>
-      </w:pPr>
-      <w:r>
-        <w:t xml:space="preserve">Try</w:t>
-      </w:r>
-      <w:r>
-        <w:t xml:space="preserve"> </w:t>
-      </w:r>
-      <w:r>
-        <w:t xml:space="preserve">“All Days”</w:t>
-      </w:r>
-      <w:r>
-        <w:t xml:space="preserve"> </w:t>
-      </w:r>
-      <w:r>
-        <w:t xml:space="preserve">and</w:t>
-      </w:r>
-      <w:r>
-        <w:t xml:space="preserve"> </w:t>
-      </w:r>
-      <w:r>
-        <w:t xml:space="preserve">“All Types”</w:t>
-      </w:r>
-    </w:p>
-    <w:p>
-      <w:pPr>
-        <w:pStyle w:val="Compact"/>
-        <w:numPr>
-          <w:ilvl w:val="1"/>
-          <w:numId w:val="1046"/>
-        </w:numPr>
-      </w:pPr>
-      <w:r>
-        <w:t xml:space="preserve">Click search again</w:t>
-      </w:r>
-    </w:p>
-    <w:p>
-      <w:pPr>
-        <w:pStyle w:val="Compact"/>
-        <w:numPr>
-          <w:ilvl w:val="0"/>
-          <w:numId w:val="1044"/>
-        </w:numPr>
-      </w:pPr>
-      <w:r>
         <w:rPr>
           <w:b/>
           <w:bCs/>
@@ -4704,7 +4916,7 @@
         <w:pStyle w:val="Compact"/>
         <w:numPr>
           <w:ilvl w:val="1"/>
-          <w:numId w:val="1047"/>
+          <w:numId w:val="1049"/>
         </w:numPr>
       </w:pPr>
       <w:r>
@@ -4716,7 +4928,7 @@
         <w:pStyle w:val="Compact"/>
         <w:numPr>
           <w:ilvl w:val="1"/>
-          <w:numId w:val="1047"/>
+          <w:numId w:val="1049"/>
         </w:numPr>
       </w:pPr>
       <w:r>
@@ -4950,7 +5162,7 @@
         <w:pStyle w:val="Compact"/>
         <w:numPr>
           <w:ilvl w:val="0"/>
-          <w:numId w:val="1048"/>
+          <w:numId w:val="1050"/>
         </w:numPr>
       </w:pPr>
       <w:r>
@@ -4966,7 +5178,7 @@
         <w:pStyle w:val="Compact"/>
         <w:numPr>
           <w:ilvl w:val="1"/>
-          <w:numId w:val="1049"/>
+          <w:numId w:val="1051"/>
         </w:numPr>
       </w:pPr>
       <w:r>
@@ -4978,7 +5190,7 @@
         <w:pStyle w:val="Compact"/>
         <w:numPr>
           <w:ilvl w:val="1"/>
-          <w:numId w:val="1049"/>
+          <w:numId w:val="1051"/>
         </w:numPr>
       </w:pPr>
       <w:r>
@@ -4990,7 +5202,7 @@
         <w:pStyle w:val="Compact"/>
         <w:numPr>
           <w:ilvl w:val="1"/>
-          <w:numId w:val="1049"/>
+          <w:numId w:val="1051"/>
         </w:numPr>
       </w:pPr>
       <w:r>
@@ -5002,7 +5214,7 @@
         <w:pStyle w:val="Compact"/>
         <w:numPr>
           <w:ilvl w:val="1"/>
-          <w:numId w:val="1049"/>
+          <w:numId w:val="1051"/>
         </w:numPr>
       </w:pPr>
       <w:r>
@@ -5014,7 +5226,7 @@
         <w:pStyle w:val="Compact"/>
         <w:numPr>
           <w:ilvl w:val="0"/>
-          <w:numId w:val="1048"/>
+          <w:numId w:val="1050"/>
         </w:numPr>
       </w:pPr>
       <w:r>
@@ -5030,7 +5242,7 @@
         <w:pStyle w:val="Compact"/>
         <w:numPr>
           <w:ilvl w:val="1"/>
-          <w:numId w:val="1050"/>
+          <w:numId w:val="1052"/>
         </w:numPr>
       </w:pPr>
       <w:r>
@@ -5048,7 +5260,7 @@
         <w:pStyle w:val="Compact"/>
         <w:numPr>
           <w:ilvl w:val="1"/>
-          <w:numId w:val="1050"/>
+          <w:numId w:val="1052"/>
         </w:numPr>
       </w:pPr>
       <w:r>
@@ -5069,7 +5281,7 @@
         <w:pStyle w:val="Compact"/>
         <w:numPr>
           <w:ilvl w:val="1"/>
-          <w:numId w:val="1050"/>
+          <w:numId w:val="1052"/>
         </w:numPr>
       </w:pPr>
       <w:r>
@@ -5343,7 +5555,7 @@
         <w:pStyle w:val="Compact"/>
         <w:numPr>
           <w:ilvl w:val="0"/>
-          <w:numId w:val="1051"/>
+          <w:numId w:val="1053"/>
         </w:numPr>
       </w:pPr>
       <w:r>
@@ -5359,7 +5571,7 @@
         <w:pStyle w:val="Compact"/>
         <w:numPr>
           <w:ilvl w:val="1"/>
-          <w:numId w:val="1052"/>
+          <w:numId w:val="1054"/>
         </w:numPr>
       </w:pPr>
       <w:r>
@@ -5371,7 +5583,7 @@
         <w:pStyle w:val="Compact"/>
         <w:numPr>
           <w:ilvl w:val="1"/>
-          <w:numId w:val="1052"/>
+          <w:numId w:val="1054"/>
         </w:numPr>
       </w:pPr>
       <w:r>
@@ -5383,7 +5595,7 @@
         <w:pStyle w:val="Compact"/>
         <w:numPr>
           <w:ilvl w:val="0"/>
-          <w:numId w:val="1051"/>
+          <w:numId w:val="1053"/>
         </w:numPr>
       </w:pPr>
       <w:r>
@@ -5399,58 +5611,58 @@
         <w:pStyle w:val="Compact"/>
         <w:numPr>
           <w:ilvl w:val="1"/>
+          <w:numId w:val="1055"/>
+        </w:numPr>
+      </w:pPr>
+      <w:r>
+        <w:t xml:space="preserve">Shorter search terms are faster</w:t>
+      </w:r>
+    </w:p>
+    <w:p>
+      <w:pPr>
+        <w:pStyle w:val="Compact"/>
+        <w:numPr>
+          <w:ilvl w:val="1"/>
+          <w:numId w:val="1055"/>
+        </w:numPr>
+      </w:pPr>
+      <w:r>
+        <w:t xml:space="preserve">“vision”</w:t>
+      </w:r>
+      <w:r>
+        <w:t xml:space="preserve"> </w:t>
+      </w:r>
+      <w:r>
+        <w:t xml:space="preserve">instead of</w:t>
+      </w:r>
+      <w:r>
+        <w:t xml:space="preserve"> </w:t>
+      </w:r>
+      <w:r>
+        <w:t xml:space="preserve">“visual neuroscience”</w:t>
+      </w:r>
+    </w:p>
+    <w:p>
+      <w:pPr>
+        <w:pStyle w:val="Compact"/>
+        <w:numPr>
+          <w:ilvl w:val="1"/>
+          <w:numId w:val="1055"/>
+        </w:numPr>
+      </w:pPr>
+      <w:r>
+        <w:t xml:space="preserve">Narrow with filters first, then search</w:t>
+      </w:r>
+    </w:p>
+    <w:p>
+      <w:pPr>
+        <w:pStyle w:val="Compact"/>
+        <w:numPr>
+          <w:ilvl w:val="0"/>
           <w:numId w:val="1053"/>
         </w:numPr>
       </w:pPr>
       <w:r>
-        <w:t xml:space="preserve">Shorter search terms are faster</w:t>
-      </w:r>
-    </w:p>
-    <w:p>
-      <w:pPr>
-        <w:pStyle w:val="Compact"/>
-        <w:numPr>
-          <w:ilvl w:val="1"/>
-          <w:numId w:val="1053"/>
-        </w:numPr>
-      </w:pPr>
-      <w:r>
-        <w:t xml:space="preserve">“vision”</w:t>
-      </w:r>
-      <w:r>
-        <w:t xml:space="preserve"> </w:t>
-      </w:r>
-      <w:r>
-        <w:t xml:space="preserve">instead of</w:t>
-      </w:r>
-      <w:r>
-        <w:t xml:space="preserve"> </w:t>
-      </w:r>
-      <w:r>
-        <w:t xml:space="preserve">“visual neuroscience”</w:t>
-      </w:r>
-    </w:p>
-    <w:p>
-      <w:pPr>
-        <w:pStyle w:val="Compact"/>
-        <w:numPr>
-          <w:ilvl w:val="1"/>
-          <w:numId w:val="1053"/>
-        </w:numPr>
-      </w:pPr>
-      <w:r>
-        <w:t xml:space="preserve">Narrow with filters first, then search</w:t>
-      </w:r>
-    </w:p>
-    <w:p>
-      <w:pPr>
-        <w:pStyle w:val="Compact"/>
-        <w:numPr>
-          <w:ilvl w:val="0"/>
-          <w:numId w:val="1051"/>
-        </w:numPr>
-      </w:pPr>
-      <w:r>
         <w:rPr>
           <w:b/>
           <w:bCs/>
@@ -5463,7 +5675,7 @@
         <w:pStyle w:val="Compact"/>
         <w:numPr>
           <w:ilvl w:val="1"/>
-          <w:numId w:val="1054"/>
+          <w:numId w:val="1056"/>
         </w:numPr>
       </w:pPr>
       <w:r>
@@ -5475,7 +5687,7 @@
         <w:pStyle w:val="Compact"/>
         <w:numPr>
           <w:ilvl w:val="1"/>
-          <w:numId w:val="1054"/>
+          <w:numId w:val="1056"/>
         </w:numPr>
       </w:pPr>
       <w:r>
@@ -5497,7 +5709,7 @@
         <w:pStyle w:val="Compact"/>
         <w:numPr>
           <w:ilvl w:val="0"/>
-          <w:numId w:val="1055"/>
+          <w:numId w:val="1057"/>
         </w:numPr>
       </w:pPr>
       <w:r>
@@ -5513,7 +5725,7 @@
         <w:pStyle w:val="Compact"/>
         <w:numPr>
           <w:ilvl w:val="1"/>
-          <w:numId w:val="1056"/>
+          <w:numId w:val="1058"/>
         </w:numPr>
       </w:pPr>
       <w:r>
@@ -5525,7 +5737,7 @@
         <w:pStyle w:val="Compact"/>
         <w:numPr>
           <w:ilvl w:val="1"/>
-          <w:numId w:val="1056"/>
+          <w:numId w:val="1058"/>
         </w:numPr>
       </w:pPr>
       <w:r>
@@ -5537,7 +5749,7 @@
         <w:pStyle w:val="Compact"/>
         <w:numPr>
           <w:ilvl w:val="0"/>
-          <w:numId w:val="1055"/>
+          <w:numId w:val="1057"/>
         </w:numPr>
       </w:pPr>
       <w:r>
@@ -5553,7 +5765,7 @@
         <w:pStyle w:val="Compact"/>
         <w:numPr>
           <w:ilvl w:val="1"/>
-          <w:numId w:val="1057"/>
+          <w:numId w:val="1059"/>
         </w:numPr>
       </w:pPr>
       <w:r>
@@ -5565,7 +5777,7 @@
         <w:pStyle w:val="Compact"/>
         <w:numPr>
           <w:ilvl w:val="1"/>
-          <w:numId w:val="1057"/>
+          <w:numId w:val="1059"/>
         </w:numPr>
       </w:pPr>
       <w:r>
@@ -5804,7 +6016,7 @@
         <w:pStyle w:val="Compact"/>
         <w:numPr>
           <w:ilvl w:val="0"/>
-          <w:numId w:val="1058"/>
+          <w:numId w:val="1060"/>
         </w:numPr>
       </w:pPr>
       <w:r>
@@ -5825,7 +6037,7 @@
         <w:pStyle w:val="Compact"/>
         <w:numPr>
           <w:ilvl w:val="0"/>
-          <w:numId w:val="1059"/>
+          <w:numId w:val="1061"/>
         </w:numPr>
       </w:pPr>
       <w:r>
@@ -5846,7 +6058,7 @@
         <w:pStyle w:val="Compact"/>
         <w:numPr>
           <w:ilvl w:val="0"/>
-          <w:numId w:val="1060"/>
+          <w:numId w:val="1062"/>
         </w:numPr>
       </w:pPr>
       <w:r>
@@ -5858,7 +6070,7 @@
         <w:pStyle w:val="Compact"/>
         <w:numPr>
           <w:ilvl w:val="0"/>
-          <w:numId w:val="1061"/>
+          <w:numId w:val="1063"/>
         </w:numPr>
       </w:pPr>
       <w:r>
@@ -5870,7 +6082,7 @@
         <w:pStyle w:val="Compact"/>
         <w:numPr>
           <w:ilvl w:val="0"/>
-          <w:numId w:val="1062"/>
+          <w:numId w:val="1064"/>
         </w:numPr>
       </w:pPr>
       <w:r>
@@ -5882,7 +6094,7 @@
         <w:pStyle w:val="Compact"/>
         <w:numPr>
           <w:ilvl w:val="0"/>
-          <w:numId w:val="1063"/>
+          <w:numId w:val="1065"/>
         </w:numPr>
       </w:pPr>
       <w:r>
@@ -5894,7 +6106,7 @@
         <w:pStyle w:val="Compact"/>
         <w:numPr>
           <w:ilvl w:val="0"/>
-          <w:numId w:val="1064"/>
+          <w:numId w:val="1066"/>
         </w:numPr>
       </w:pPr>
       <w:r>
@@ -5916,7 +6128,7 @@
         <w:pStyle w:val="Compact"/>
         <w:numPr>
           <w:ilvl w:val="0"/>
-          <w:numId w:val="1065"/>
+          <w:numId w:val="1067"/>
         </w:numPr>
       </w:pPr>
       <w:r>
@@ -5938,7 +6150,7 @@
         <w:pStyle w:val="Compact"/>
         <w:numPr>
           <w:ilvl w:val="0"/>
-          <w:numId w:val="1065"/>
+          <w:numId w:val="1067"/>
         </w:numPr>
       </w:pPr>
       <w:r>
@@ -5960,7 +6172,7 @@
         <w:pStyle w:val="Compact"/>
         <w:numPr>
           <w:ilvl w:val="0"/>
-          <w:numId w:val="1065"/>
+          <w:numId w:val="1067"/>
         </w:numPr>
       </w:pPr>
       <w:r>
@@ -5982,7 +6194,7 @@
         <w:pStyle w:val="Compact"/>
         <w:numPr>
           <w:ilvl w:val="0"/>
-          <w:numId w:val="1065"/>
+          <w:numId w:val="1067"/>
         </w:numPr>
       </w:pPr>
       <w:r>
@@ -6031,7 +6243,7 @@
         <w:pStyle w:val="Compact"/>
         <w:numPr>
           <w:ilvl w:val="0"/>
-          <w:numId w:val="1066"/>
+          <w:numId w:val="1068"/>
         </w:numPr>
       </w:pPr>
       <w:r>
@@ -6043,7 +6255,7 @@
         <w:pStyle w:val="Compact"/>
         <w:numPr>
           <w:ilvl w:val="0"/>
-          <w:numId w:val="1066"/>
+          <w:numId w:val="1068"/>
         </w:numPr>
       </w:pPr>
       <w:r>
@@ -6070,7 +6282,7 @@
         <w:pStyle w:val="Compact"/>
         <w:numPr>
           <w:ilvl w:val="0"/>
-          <w:numId w:val="1066"/>
+          <w:numId w:val="1068"/>
         </w:numPr>
       </w:pPr>
       <w:r>
@@ -6082,7 +6294,7 @@
         <w:pStyle w:val="Compact"/>
         <w:numPr>
           <w:ilvl w:val="0"/>
-          <w:numId w:val="1066"/>
+          <w:numId w:val="1068"/>
         </w:numPr>
       </w:pPr>
       <w:r>
@@ -6104,7 +6316,7 @@
         <w:pStyle w:val="Compact"/>
         <w:numPr>
           <w:ilvl w:val="0"/>
-          <w:numId w:val="1067"/>
+          <w:numId w:val="1069"/>
         </w:numPr>
       </w:pPr>
       <w:r>
@@ -6116,7 +6328,7 @@
         <w:pStyle w:val="Compact"/>
         <w:numPr>
           <w:ilvl w:val="0"/>
-          <w:numId w:val="1067"/>
+          <w:numId w:val="1069"/>
         </w:numPr>
       </w:pPr>
       <w:r>
@@ -6143,7 +6355,7 @@
         <w:pStyle w:val="Compact"/>
         <w:numPr>
           <w:ilvl w:val="0"/>
-          <w:numId w:val="1067"/>
+          <w:numId w:val="1069"/>
         </w:numPr>
       </w:pPr>
       <w:r>
@@ -6165,7 +6377,7 @@
         <w:pStyle w:val="Compact"/>
         <w:numPr>
           <w:ilvl w:val="0"/>
-          <w:numId w:val="1068"/>
+          <w:numId w:val="1070"/>
         </w:numPr>
       </w:pPr>
       <w:r>
@@ -6177,7 +6389,7 @@
         <w:pStyle w:val="Compact"/>
         <w:numPr>
           <w:ilvl w:val="0"/>
-          <w:numId w:val="1068"/>
+          <w:numId w:val="1070"/>
         </w:numPr>
       </w:pPr>
       <w:r>
@@ -6189,7 +6401,7 @@
         <w:pStyle w:val="Compact"/>
         <w:numPr>
           <w:ilvl w:val="0"/>
-          <w:numId w:val="1068"/>
+          <w:numId w:val="1070"/>
         </w:numPr>
       </w:pPr>
       <w:r>
@@ -6201,7 +6413,7 @@
         <w:pStyle w:val="Compact"/>
         <w:numPr>
           <w:ilvl w:val="0"/>
-          <w:numId w:val="1068"/>
+          <w:numId w:val="1070"/>
         </w:numPr>
       </w:pPr>
       <w:r>
@@ -6223,7 +6435,7 @@
         <w:pStyle w:val="Compact"/>
         <w:numPr>
           <w:ilvl w:val="0"/>
-          <w:numId w:val="1069"/>
+          <w:numId w:val="1071"/>
         </w:numPr>
       </w:pPr>
       <w:r>
@@ -6235,7 +6447,7 @@
         <w:pStyle w:val="Compact"/>
         <w:numPr>
           <w:ilvl w:val="0"/>
-          <w:numId w:val="1069"/>
+          <w:numId w:val="1071"/>
         </w:numPr>
       </w:pPr>
       <w:r>
@@ -6247,7 +6459,7 @@
         <w:pStyle w:val="Compact"/>
         <w:numPr>
           <w:ilvl w:val="0"/>
-          <w:numId w:val="1069"/>
+          <w:numId w:val="1071"/>
         </w:numPr>
       </w:pPr>
       <w:r>
@@ -7241,6 +7453,9 @@
     <w:abstractNumId w:val="991"/>
   </w:num>
   <w:num w:numId="1023">
+    <w:abstractNumId w:val="991"/>
+  </w:num>
+  <w:num w:numId="1024">
     <w:abstractNumId w:val="99411"/>
     <w:lvlOverride w:ilvl="0">
       <w:startOverride w:val="1"/>
@@ -7269,9 +7484,6 @@
     <w:lvlOverride w:ilvl="8">
       <w:startOverride w:val="1"/>
     </w:lvlOverride>
-  </w:num>
-  <w:num w:numId="1024">
-    <w:abstractNumId w:val="991"/>
   </w:num>
   <w:num w:numId="1025">
     <w:abstractNumId w:val="991"/>
@@ -7280,40 +7492,40 @@
     <w:abstractNumId w:val="991"/>
   </w:num>
   <w:num w:numId="1027">
-    <w:abstractNumId w:val="99411"/>
-    <w:lvlOverride w:ilvl="0">
-      <w:startOverride w:val="1"/>
-    </w:lvlOverride>
-    <w:lvlOverride w:ilvl="1">
-      <w:startOverride w:val="1"/>
-    </w:lvlOverride>
-    <w:lvlOverride w:ilvl="2">
-      <w:startOverride w:val="1"/>
-    </w:lvlOverride>
-    <w:lvlOverride w:ilvl="3">
-      <w:startOverride w:val="1"/>
-    </w:lvlOverride>
-    <w:lvlOverride w:ilvl="4">
-      <w:startOverride w:val="1"/>
-    </w:lvlOverride>
-    <w:lvlOverride w:ilvl="5">
-      <w:startOverride w:val="1"/>
-    </w:lvlOverride>
-    <w:lvlOverride w:ilvl="6">
-      <w:startOverride w:val="1"/>
-    </w:lvlOverride>
-    <w:lvlOverride w:ilvl="7">
-      <w:startOverride w:val="1"/>
-    </w:lvlOverride>
-    <w:lvlOverride w:ilvl="8">
-      <w:startOverride w:val="1"/>
-    </w:lvlOverride>
+    <w:abstractNumId w:val="991"/>
   </w:num>
   <w:num w:numId="1028">
     <w:abstractNumId w:val="991"/>
   </w:num>
   <w:num w:numId="1029">
-    <w:abstractNumId w:val="991"/>
+    <w:abstractNumId w:val="99411"/>
+    <w:lvlOverride w:ilvl="0">
+      <w:startOverride w:val="1"/>
+    </w:lvlOverride>
+    <w:lvlOverride w:ilvl="1">
+      <w:startOverride w:val="1"/>
+    </w:lvlOverride>
+    <w:lvlOverride w:ilvl="2">
+      <w:startOverride w:val="1"/>
+    </w:lvlOverride>
+    <w:lvlOverride w:ilvl="3">
+      <w:startOverride w:val="1"/>
+    </w:lvlOverride>
+    <w:lvlOverride w:ilvl="4">
+      <w:startOverride w:val="1"/>
+    </w:lvlOverride>
+    <w:lvlOverride w:ilvl="5">
+      <w:startOverride w:val="1"/>
+    </w:lvlOverride>
+    <w:lvlOverride w:ilvl="6">
+      <w:startOverride w:val="1"/>
+    </w:lvlOverride>
+    <w:lvlOverride w:ilvl="7">
+      <w:startOverride w:val="1"/>
+    </w:lvlOverride>
+    <w:lvlOverride w:ilvl="8">
+      <w:startOverride w:val="1"/>
+    </w:lvlOverride>
   </w:num>
   <w:num w:numId="1030">
     <w:abstractNumId w:val="991"/>
@@ -7322,277 +7534,277 @@
     <w:abstractNumId w:val="991"/>
   </w:num>
   <w:num w:numId="1032">
-    <w:abstractNumId w:val="99411"/>
-    <w:lvlOverride w:ilvl="0">
-      <w:startOverride w:val="1"/>
-    </w:lvlOverride>
-    <w:lvlOverride w:ilvl="1">
-      <w:startOverride w:val="1"/>
-    </w:lvlOverride>
-    <w:lvlOverride w:ilvl="2">
-      <w:startOverride w:val="1"/>
-    </w:lvlOverride>
-    <w:lvlOverride w:ilvl="3">
-      <w:startOverride w:val="1"/>
-    </w:lvlOverride>
-    <w:lvlOverride w:ilvl="4">
-      <w:startOverride w:val="1"/>
-    </w:lvlOverride>
-    <w:lvlOverride w:ilvl="5">
-      <w:startOverride w:val="1"/>
-    </w:lvlOverride>
-    <w:lvlOverride w:ilvl="6">
-      <w:startOverride w:val="1"/>
-    </w:lvlOverride>
-    <w:lvlOverride w:ilvl="7">
-      <w:startOverride w:val="1"/>
-    </w:lvlOverride>
-    <w:lvlOverride w:ilvl="8">
-      <w:startOverride w:val="1"/>
-    </w:lvlOverride>
+    <w:abstractNumId w:val="991"/>
   </w:num>
   <w:num w:numId="1033">
     <w:abstractNumId w:val="991"/>
   </w:num>
   <w:num w:numId="1034">
-    <w:abstractNumId w:val="991"/>
+    <w:abstractNumId w:val="99411"/>
+    <w:lvlOverride w:ilvl="0">
+      <w:startOverride w:val="1"/>
+    </w:lvlOverride>
+    <w:lvlOverride w:ilvl="1">
+      <w:startOverride w:val="1"/>
+    </w:lvlOverride>
+    <w:lvlOverride w:ilvl="2">
+      <w:startOverride w:val="1"/>
+    </w:lvlOverride>
+    <w:lvlOverride w:ilvl="3">
+      <w:startOverride w:val="1"/>
+    </w:lvlOverride>
+    <w:lvlOverride w:ilvl="4">
+      <w:startOverride w:val="1"/>
+    </w:lvlOverride>
+    <w:lvlOverride w:ilvl="5">
+      <w:startOverride w:val="1"/>
+    </w:lvlOverride>
+    <w:lvlOverride w:ilvl="6">
+      <w:startOverride w:val="1"/>
+    </w:lvlOverride>
+    <w:lvlOverride w:ilvl="7">
+      <w:startOverride w:val="1"/>
+    </w:lvlOverride>
+    <w:lvlOverride w:ilvl="8">
+      <w:startOverride w:val="1"/>
+    </w:lvlOverride>
   </w:num>
   <w:num w:numId="1035">
     <w:abstractNumId w:val="991"/>
   </w:num>
   <w:num w:numId="1036">
-    <w:abstractNumId w:val="99411"/>
-    <w:lvlOverride w:ilvl="0">
-      <w:startOverride w:val="1"/>
-    </w:lvlOverride>
-    <w:lvlOverride w:ilvl="1">
-      <w:startOverride w:val="1"/>
-    </w:lvlOverride>
-    <w:lvlOverride w:ilvl="2">
-      <w:startOverride w:val="1"/>
-    </w:lvlOverride>
-    <w:lvlOverride w:ilvl="3">
-      <w:startOverride w:val="1"/>
-    </w:lvlOverride>
-    <w:lvlOverride w:ilvl="4">
-      <w:startOverride w:val="1"/>
-    </w:lvlOverride>
-    <w:lvlOverride w:ilvl="5">
-      <w:startOverride w:val="1"/>
-    </w:lvlOverride>
-    <w:lvlOverride w:ilvl="6">
-      <w:startOverride w:val="1"/>
-    </w:lvlOverride>
-    <w:lvlOverride w:ilvl="7">
-      <w:startOverride w:val="1"/>
-    </w:lvlOverride>
-    <w:lvlOverride w:ilvl="8">
-      <w:startOverride w:val="1"/>
-    </w:lvlOverride>
+    <w:abstractNumId w:val="991"/>
   </w:num>
   <w:num w:numId="1037">
     <w:abstractNumId w:val="991"/>
   </w:num>
   <w:num w:numId="1038">
-    <w:abstractNumId w:val="991"/>
+    <w:abstractNumId w:val="99411"/>
+    <w:lvlOverride w:ilvl="0">
+      <w:startOverride w:val="1"/>
+    </w:lvlOverride>
+    <w:lvlOverride w:ilvl="1">
+      <w:startOverride w:val="1"/>
+    </w:lvlOverride>
+    <w:lvlOverride w:ilvl="2">
+      <w:startOverride w:val="1"/>
+    </w:lvlOverride>
+    <w:lvlOverride w:ilvl="3">
+      <w:startOverride w:val="1"/>
+    </w:lvlOverride>
+    <w:lvlOverride w:ilvl="4">
+      <w:startOverride w:val="1"/>
+    </w:lvlOverride>
+    <w:lvlOverride w:ilvl="5">
+      <w:startOverride w:val="1"/>
+    </w:lvlOverride>
+    <w:lvlOverride w:ilvl="6">
+      <w:startOverride w:val="1"/>
+    </w:lvlOverride>
+    <w:lvlOverride w:ilvl="7">
+      <w:startOverride w:val="1"/>
+    </w:lvlOverride>
+    <w:lvlOverride w:ilvl="8">
+      <w:startOverride w:val="1"/>
+    </w:lvlOverride>
   </w:num>
   <w:num w:numId="1039">
     <w:abstractNumId w:val="991"/>
   </w:num>
   <w:num w:numId="1040">
-    <w:abstractNumId w:val="99411"/>
-    <w:lvlOverride w:ilvl="0">
-      <w:startOverride w:val="1"/>
-    </w:lvlOverride>
-    <w:lvlOverride w:ilvl="1">
-      <w:startOverride w:val="1"/>
-    </w:lvlOverride>
-    <w:lvlOverride w:ilvl="2">
-      <w:startOverride w:val="1"/>
-    </w:lvlOverride>
-    <w:lvlOverride w:ilvl="3">
-      <w:startOverride w:val="1"/>
-    </w:lvlOverride>
-    <w:lvlOverride w:ilvl="4">
-      <w:startOverride w:val="1"/>
-    </w:lvlOverride>
-    <w:lvlOverride w:ilvl="5">
-      <w:startOverride w:val="1"/>
-    </w:lvlOverride>
-    <w:lvlOverride w:ilvl="6">
-      <w:startOverride w:val="1"/>
-    </w:lvlOverride>
-    <w:lvlOverride w:ilvl="7">
-      <w:startOverride w:val="1"/>
-    </w:lvlOverride>
-    <w:lvlOverride w:ilvl="8">
-      <w:startOverride w:val="1"/>
-    </w:lvlOverride>
+    <w:abstractNumId w:val="991"/>
   </w:num>
   <w:num w:numId="1041">
     <w:abstractNumId w:val="991"/>
   </w:num>
   <w:num w:numId="1042">
-    <w:abstractNumId w:val="991"/>
+    <w:abstractNumId w:val="99411"/>
+    <w:lvlOverride w:ilvl="0">
+      <w:startOverride w:val="1"/>
+    </w:lvlOverride>
+    <w:lvlOverride w:ilvl="1">
+      <w:startOverride w:val="1"/>
+    </w:lvlOverride>
+    <w:lvlOverride w:ilvl="2">
+      <w:startOverride w:val="1"/>
+    </w:lvlOverride>
+    <w:lvlOverride w:ilvl="3">
+      <w:startOverride w:val="1"/>
+    </w:lvlOverride>
+    <w:lvlOverride w:ilvl="4">
+      <w:startOverride w:val="1"/>
+    </w:lvlOverride>
+    <w:lvlOverride w:ilvl="5">
+      <w:startOverride w:val="1"/>
+    </w:lvlOverride>
+    <w:lvlOverride w:ilvl="6">
+      <w:startOverride w:val="1"/>
+    </w:lvlOverride>
+    <w:lvlOverride w:ilvl="7">
+      <w:startOverride w:val="1"/>
+    </w:lvlOverride>
+    <w:lvlOverride w:ilvl="8">
+      <w:startOverride w:val="1"/>
+    </w:lvlOverride>
   </w:num>
   <w:num w:numId="1043">
     <w:abstractNumId w:val="991"/>
   </w:num>
   <w:num w:numId="1044">
-    <w:abstractNumId w:val="99411"/>
-    <w:lvlOverride w:ilvl="0">
-      <w:startOverride w:val="1"/>
-    </w:lvlOverride>
-    <w:lvlOverride w:ilvl="1">
-      <w:startOverride w:val="1"/>
-    </w:lvlOverride>
-    <w:lvlOverride w:ilvl="2">
-      <w:startOverride w:val="1"/>
-    </w:lvlOverride>
-    <w:lvlOverride w:ilvl="3">
-      <w:startOverride w:val="1"/>
-    </w:lvlOverride>
-    <w:lvlOverride w:ilvl="4">
-      <w:startOverride w:val="1"/>
-    </w:lvlOverride>
-    <w:lvlOverride w:ilvl="5">
-      <w:startOverride w:val="1"/>
-    </w:lvlOverride>
-    <w:lvlOverride w:ilvl="6">
-      <w:startOverride w:val="1"/>
-    </w:lvlOverride>
-    <w:lvlOverride w:ilvl="7">
-      <w:startOverride w:val="1"/>
-    </w:lvlOverride>
-    <w:lvlOverride w:ilvl="8">
-      <w:startOverride w:val="1"/>
-    </w:lvlOverride>
+    <w:abstractNumId w:val="991"/>
   </w:num>
   <w:num w:numId="1045">
     <w:abstractNumId w:val="991"/>
   </w:num>
   <w:num w:numId="1046">
-    <w:abstractNumId w:val="991"/>
+    <w:abstractNumId w:val="99411"/>
+    <w:lvlOverride w:ilvl="0">
+      <w:startOverride w:val="1"/>
+    </w:lvlOverride>
+    <w:lvlOverride w:ilvl="1">
+      <w:startOverride w:val="1"/>
+    </w:lvlOverride>
+    <w:lvlOverride w:ilvl="2">
+      <w:startOverride w:val="1"/>
+    </w:lvlOverride>
+    <w:lvlOverride w:ilvl="3">
+      <w:startOverride w:val="1"/>
+    </w:lvlOverride>
+    <w:lvlOverride w:ilvl="4">
+      <w:startOverride w:val="1"/>
+    </w:lvlOverride>
+    <w:lvlOverride w:ilvl="5">
+      <w:startOverride w:val="1"/>
+    </w:lvlOverride>
+    <w:lvlOverride w:ilvl="6">
+      <w:startOverride w:val="1"/>
+    </w:lvlOverride>
+    <w:lvlOverride w:ilvl="7">
+      <w:startOverride w:val="1"/>
+    </w:lvlOverride>
+    <w:lvlOverride w:ilvl="8">
+      <w:startOverride w:val="1"/>
+    </w:lvlOverride>
   </w:num>
   <w:num w:numId="1047">
     <w:abstractNumId w:val="991"/>
   </w:num>
   <w:num w:numId="1048">
-    <w:abstractNumId w:val="99411"/>
-    <w:lvlOverride w:ilvl="0">
-      <w:startOverride w:val="1"/>
-    </w:lvlOverride>
-    <w:lvlOverride w:ilvl="1">
-      <w:startOverride w:val="1"/>
-    </w:lvlOverride>
-    <w:lvlOverride w:ilvl="2">
-      <w:startOverride w:val="1"/>
-    </w:lvlOverride>
-    <w:lvlOverride w:ilvl="3">
-      <w:startOverride w:val="1"/>
-    </w:lvlOverride>
-    <w:lvlOverride w:ilvl="4">
-      <w:startOverride w:val="1"/>
-    </w:lvlOverride>
-    <w:lvlOverride w:ilvl="5">
-      <w:startOverride w:val="1"/>
-    </w:lvlOverride>
-    <w:lvlOverride w:ilvl="6">
-      <w:startOverride w:val="1"/>
-    </w:lvlOverride>
-    <w:lvlOverride w:ilvl="7">
-      <w:startOverride w:val="1"/>
-    </w:lvlOverride>
-    <w:lvlOverride w:ilvl="8">
-      <w:startOverride w:val="1"/>
-    </w:lvlOverride>
+    <w:abstractNumId w:val="991"/>
   </w:num>
   <w:num w:numId="1049">
     <w:abstractNumId w:val="991"/>
   </w:num>
   <w:num w:numId="1050">
-    <w:abstractNumId w:val="991"/>
+    <w:abstractNumId w:val="99411"/>
+    <w:lvlOverride w:ilvl="0">
+      <w:startOverride w:val="1"/>
+    </w:lvlOverride>
+    <w:lvlOverride w:ilvl="1">
+      <w:startOverride w:val="1"/>
+    </w:lvlOverride>
+    <w:lvlOverride w:ilvl="2">
+      <w:startOverride w:val="1"/>
+    </w:lvlOverride>
+    <w:lvlOverride w:ilvl="3">
+      <w:startOverride w:val="1"/>
+    </w:lvlOverride>
+    <w:lvlOverride w:ilvl="4">
+      <w:startOverride w:val="1"/>
+    </w:lvlOverride>
+    <w:lvlOverride w:ilvl="5">
+      <w:startOverride w:val="1"/>
+    </w:lvlOverride>
+    <w:lvlOverride w:ilvl="6">
+      <w:startOverride w:val="1"/>
+    </w:lvlOverride>
+    <w:lvlOverride w:ilvl="7">
+      <w:startOverride w:val="1"/>
+    </w:lvlOverride>
+    <w:lvlOverride w:ilvl="8">
+      <w:startOverride w:val="1"/>
+    </w:lvlOverride>
   </w:num>
   <w:num w:numId="1051">
-    <w:abstractNumId w:val="99411"/>
-    <w:lvlOverride w:ilvl="0">
-      <w:startOverride w:val="1"/>
-    </w:lvlOverride>
-    <w:lvlOverride w:ilvl="1">
-      <w:startOverride w:val="1"/>
-    </w:lvlOverride>
-    <w:lvlOverride w:ilvl="2">
-      <w:startOverride w:val="1"/>
-    </w:lvlOverride>
-    <w:lvlOverride w:ilvl="3">
-      <w:startOverride w:val="1"/>
-    </w:lvlOverride>
-    <w:lvlOverride w:ilvl="4">
-      <w:startOverride w:val="1"/>
-    </w:lvlOverride>
-    <w:lvlOverride w:ilvl="5">
-      <w:startOverride w:val="1"/>
-    </w:lvlOverride>
-    <w:lvlOverride w:ilvl="6">
-      <w:startOverride w:val="1"/>
-    </w:lvlOverride>
-    <w:lvlOverride w:ilvl="7">
-      <w:startOverride w:val="1"/>
-    </w:lvlOverride>
-    <w:lvlOverride w:ilvl="8">
-      <w:startOverride w:val="1"/>
-    </w:lvlOverride>
+    <w:abstractNumId w:val="991"/>
   </w:num>
   <w:num w:numId="1052">
     <w:abstractNumId w:val="991"/>
   </w:num>
   <w:num w:numId="1053">
-    <w:abstractNumId w:val="991"/>
+    <w:abstractNumId w:val="99411"/>
+    <w:lvlOverride w:ilvl="0">
+      <w:startOverride w:val="1"/>
+    </w:lvlOverride>
+    <w:lvlOverride w:ilvl="1">
+      <w:startOverride w:val="1"/>
+    </w:lvlOverride>
+    <w:lvlOverride w:ilvl="2">
+      <w:startOverride w:val="1"/>
+    </w:lvlOverride>
+    <w:lvlOverride w:ilvl="3">
+      <w:startOverride w:val="1"/>
+    </w:lvlOverride>
+    <w:lvlOverride w:ilvl="4">
+      <w:startOverride w:val="1"/>
+    </w:lvlOverride>
+    <w:lvlOverride w:ilvl="5">
+      <w:startOverride w:val="1"/>
+    </w:lvlOverride>
+    <w:lvlOverride w:ilvl="6">
+      <w:startOverride w:val="1"/>
+    </w:lvlOverride>
+    <w:lvlOverride w:ilvl="7">
+      <w:startOverride w:val="1"/>
+    </w:lvlOverride>
+    <w:lvlOverride w:ilvl="8">
+      <w:startOverride w:val="1"/>
+    </w:lvlOverride>
   </w:num>
   <w:num w:numId="1054">
     <w:abstractNumId w:val="991"/>
   </w:num>
   <w:num w:numId="1055">
-    <w:abstractNumId w:val="99411"/>
-    <w:lvlOverride w:ilvl="0">
-      <w:startOverride w:val="1"/>
-    </w:lvlOverride>
-    <w:lvlOverride w:ilvl="1">
-      <w:startOverride w:val="1"/>
-    </w:lvlOverride>
-    <w:lvlOverride w:ilvl="2">
-      <w:startOverride w:val="1"/>
-    </w:lvlOverride>
-    <w:lvlOverride w:ilvl="3">
-      <w:startOverride w:val="1"/>
-    </w:lvlOverride>
-    <w:lvlOverride w:ilvl="4">
-      <w:startOverride w:val="1"/>
-    </w:lvlOverride>
-    <w:lvlOverride w:ilvl="5">
-      <w:startOverride w:val="1"/>
-    </w:lvlOverride>
-    <w:lvlOverride w:ilvl="6">
-      <w:startOverride w:val="1"/>
-    </w:lvlOverride>
-    <w:lvlOverride w:ilvl="7">
-      <w:startOverride w:val="1"/>
-    </w:lvlOverride>
-    <w:lvlOverride w:ilvl="8">
-      <w:startOverride w:val="1"/>
-    </w:lvlOverride>
+    <w:abstractNumId w:val="991"/>
   </w:num>
   <w:num w:numId="1056">
     <w:abstractNumId w:val="991"/>
   </w:num>
   <w:num w:numId="1057">
+    <w:abstractNumId w:val="99411"/>
+    <w:lvlOverride w:ilvl="0">
+      <w:startOverride w:val="1"/>
+    </w:lvlOverride>
+    <w:lvlOverride w:ilvl="1">
+      <w:startOverride w:val="1"/>
+    </w:lvlOverride>
+    <w:lvlOverride w:ilvl="2">
+      <w:startOverride w:val="1"/>
+    </w:lvlOverride>
+    <w:lvlOverride w:ilvl="3">
+      <w:startOverride w:val="1"/>
+    </w:lvlOverride>
+    <w:lvlOverride w:ilvl="4">
+      <w:startOverride w:val="1"/>
+    </w:lvlOverride>
+    <w:lvlOverride w:ilvl="5">
+      <w:startOverride w:val="1"/>
+    </w:lvlOverride>
+    <w:lvlOverride w:ilvl="6">
+      <w:startOverride w:val="1"/>
+    </w:lvlOverride>
+    <w:lvlOverride w:ilvl="7">
+      <w:startOverride w:val="1"/>
+    </w:lvlOverride>
+    <w:lvlOverride w:ilvl="8">
+      <w:startOverride w:val="1"/>
+    </w:lvlOverride>
+  </w:num>
+  <w:num w:numId="1058">
     <w:abstractNumId w:val="991"/>
   </w:num>
-  <w:num w:numId="1058">
-    <w:abstractNumId w:val="992"/>
-  </w:num>
   <w:num w:numId="1059">
-    <w:abstractNumId w:val="992"/>
+    <w:abstractNumId w:val="991"/>
   </w:num>
   <w:num w:numId="1060">
     <w:abstractNumId w:val="992"/>
@@ -7610,67 +7822,13 @@
     <w:abstractNumId w:val="992"/>
   </w:num>
   <w:num w:numId="1065">
-    <w:abstractNumId w:val="991"/>
+    <w:abstractNumId w:val="992"/>
   </w:num>
   <w:num w:numId="1066">
-    <w:abstractNumId w:val="99411"/>
-    <w:lvlOverride w:ilvl="0">
-      <w:startOverride w:val="1"/>
-    </w:lvlOverride>
-    <w:lvlOverride w:ilvl="1">
-      <w:startOverride w:val="1"/>
-    </w:lvlOverride>
-    <w:lvlOverride w:ilvl="2">
-      <w:startOverride w:val="1"/>
-    </w:lvlOverride>
-    <w:lvlOverride w:ilvl="3">
-      <w:startOverride w:val="1"/>
-    </w:lvlOverride>
-    <w:lvlOverride w:ilvl="4">
-      <w:startOverride w:val="1"/>
-    </w:lvlOverride>
-    <w:lvlOverride w:ilvl="5">
-      <w:startOverride w:val="1"/>
-    </w:lvlOverride>
-    <w:lvlOverride w:ilvl="6">
-      <w:startOverride w:val="1"/>
-    </w:lvlOverride>
-    <w:lvlOverride w:ilvl="7">
-      <w:startOverride w:val="1"/>
-    </w:lvlOverride>
-    <w:lvlOverride w:ilvl="8">
-      <w:startOverride w:val="1"/>
-    </w:lvlOverride>
+    <w:abstractNumId w:val="992"/>
   </w:num>
   <w:num w:numId="1067">
-    <w:abstractNumId w:val="99411"/>
-    <w:lvlOverride w:ilvl="0">
-      <w:startOverride w:val="1"/>
-    </w:lvlOverride>
-    <w:lvlOverride w:ilvl="1">
-      <w:startOverride w:val="1"/>
-    </w:lvlOverride>
-    <w:lvlOverride w:ilvl="2">
-      <w:startOverride w:val="1"/>
-    </w:lvlOverride>
-    <w:lvlOverride w:ilvl="3">
-      <w:startOverride w:val="1"/>
-    </w:lvlOverride>
-    <w:lvlOverride w:ilvl="4">
-      <w:startOverride w:val="1"/>
-    </w:lvlOverride>
-    <w:lvlOverride w:ilvl="5">
-      <w:startOverride w:val="1"/>
-    </w:lvlOverride>
-    <w:lvlOverride w:ilvl="6">
-      <w:startOverride w:val="1"/>
-    </w:lvlOverride>
-    <w:lvlOverride w:ilvl="7">
-      <w:startOverride w:val="1"/>
-    </w:lvlOverride>
-    <w:lvlOverride w:ilvl="8">
-      <w:startOverride w:val="1"/>
-    </w:lvlOverride>
+    <w:abstractNumId w:val="991"/>
   </w:num>
   <w:num w:numId="1068">
     <w:abstractNumId w:val="99411"/>
@@ -7703,6 +7861,66 @@
     </w:lvlOverride>
   </w:num>
   <w:num w:numId="1069">
+    <w:abstractNumId w:val="99411"/>
+    <w:lvlOverride w:ilvl="0">
+      <w:startOverride w:val="1"/>
+    </w:lvlOverride>
+    <w:lvlOverride w:ilvl="1">
+      <w:startOverride w:val="1"/>
+    </w:lvlOverride>
+    <w:lvlOverride w:ilvl="2">
+      <w:startOverride w:val="1"/>
+    </w:lvlOverride>
+    <w:lvlOverride w:ilvl="3">
+      <w:startOverride w:val="1"/>
+    </w:lvlOverride>
+    <w:lvlOverride w:ilvl="4">
+      <w:startOverride w:val="1"/>
+    </w:lvlOverride>
+    <w:lvlOverride w:ilvl="5">
+      <w:startOverride w:val="1"/>
+    </w:lvlOverride>
+    <w:lvlOverride w:ilvl="6">
+      <w:startOverride w:val="1"/>
+    </w:lvlOverride>
+    <w:lvlOverride w:ilvl="7">
+      <w:startOverride w:val="1"/>
+    </w:lvlOverride>
+    <w:lvlOverride w:ilvl="8">
+      <w:startOverride w:val="1"/>
+    </w:lvlOverride>
+  </w:num>
+  <w:num w:numId="1070">
+    <w:abstractNumId w:val="99411"/>
+    <w:lvlOverride w:ilvl="0">
+      <w:startOverride w:val="1"/>
+    </w:lvlOverride>
+    <w:lvlOverride w:ilvl="1">
+      <w:startOverride w:val="1"/>
+    </w:lvlOverride>
+    <w:lvlOverride w:ilvl="2">
+      <w:startOverride w:val="1"/>
+    </w:lvlOverride>
+    <w:lvlOverride w:ilvl="3">
+      <w:startOverride w:val="1"/>
+    </w:lvlOverride>
+    <w:lvlOverride w:ilvl="4">
+      <w:startOverride w:val="1"/>
+    </w:lvlOverride>
+    <w:lvlOverride w:ilvl="5">
+      <w:startOverride w:val="1"/>
+    </w:lvlOverride>
+    <w:lvlOverride w:ilvl="6">
+      <w:startOverride w:val="1"/>
+    </w:lvlOverride>
+    <w:lvlOverride w:ilvl="7">
+      <w:startOverride w:val="1"/>
+    </w:lvlOverride>
+    <w:lvlOverride w:ilvl="8">
+      <w:startOverride w:val="1"/>
+    </w:lvlOverride>
+  </w:num>
+  <w:num w:numId="1071">
     <w:abstractNumId w:val="99411"/>
     <w:lvlOverride w:ilvl="0">
       <w:startOverride w:val="1"/>

</xml_diff>

<commit_message>
Add Google Calendar alarm warning to guide and README
Apple Calendar export suppresses alarms automatically; Google Calendar applies
the user's default reminder. Added a prominent note advising users to set their
Google Calendar default notification to None before the conference.

Co-Authored-By: Claude Sonnet 4.6 <noreply@anthropic.com>
</commit_message>
<xml_diff>
--- a/VSS_2026_Scheduler_Guide.docx
+++ b/VSS_2026_Scheduler_Guide.docx
@@ -2784,6 +2784,160 @@
       </w:pPr>
       <w:r>
         <w:t xml:space="preserve">Exporting to Google Calendar</w:t>
+      </w:r>
+    </w:p>
+    <w:p>
+      <w:pPr>
+        <w:pStyle w:val="BlockText"/>
+      </w:pPr>
+      <w:r>
+        <w:rPr>
+          <w:b/>
+          <w:bCs/>
+        </w:rPr>
+        <w:t xml:space="preserve">Important — Suppress Google Calendar Alarms:</w:t>
+      </w:r>
+      <w:r>
+        <w:t xml:space="preserve"> </w:t>
+      </w:r>
+      <w:r>
+        <w:t xml:space="preserve">Google Calendar automatically adds a default reminder (usually 30 minutes) to every new event. During a conference this will cause your phone to alert repeatedly throughout the day. Before or after exporting, we recommend turning off the default reminder in Google Calendar:</w:t>
+      </w:r>
+      <w:r>
+        <w:t xml:space="preserve"> </w:t>
+      </w:r>
+      <w:r>
+        <w:t xml:space="preserve">- Open the Google Calendar app → tap the</w:t>
+      </w:r>
+      <w:r>
+        <w:t xml:space="preserve"> </w:t>
+      </w:r>
+      <w:r>
+        <w:rPr>
+          <w:b/>
+          <w:bCs/>
+        </w:rPr>
+        <w:t xml:space="preserve">☰ Menu</w:t>
+      </w:r>
+      <w:r>
+        <w:t xml:space="preserve"> </w:t>
+      </w:r>
+      <w:r>
+        <w:t xml:space="preserve">→</w:t>
+      </w:r>
+      <w:r>
+        <w:t xml:space="preserve"> </w:t>
+      </w:r>
+      <w:r>
+        <w:rPr>
+          <w:b/>
+          <w:bCs/>
+        </w:rPr>
+        <w:t xml:space="preserve">Settings</w:t>
+      </w:r>
+      <w:r>
+        <w:t xml:space="preserve"> </w:t>
+      </w:r>
+      <w:r>
+        <w:t xml:space="preserve">→</w:t>
+      </w:r>
+      <w:r>
+        <w:t xml:space="preserve"> </w:t>
+      </w:r>
+      <w:r>
+        <w:rPr>
+          <w:b/>
+          <w:bCs/>
+        </w:rPr>
+        <w:t xml:space="preserve">Events from Gmail</w:t>
+      </w:r>
+      <w:r>
+        <w:t xml:space="preserve"> </w:t>
+      </w:r>
+      <w:r>
+        <w:t xml:space="preserve">(or</w:t>
+      </w:r>
+      <w:r>
+        <w:t xml:space="preserve"> </w:t>
+      </w:r>
+      <w:r>
+        <w:rPr>
+          <w:b/>
+          <w:bCs/>
+        </w:rPr>
+        <w:t xml:space="preserve">General</w:t>
+      </w:r>
+      <w:r>
+        <w:t xml:space="preserve"> </w:t>
+      </w:r>
+      <w:r>
+        <w:t xml:space="preserve">→</w:t>
+      </w:r>
+      <w:r>
+        <w:t xml:space="preserve"> </w:t>
+      </w:r>
+      <w:r>
+        <w:rPr>
+          <w:b/>
+          <w:bCs/>
+        </w:rPr>
+        <w:t xml:space="preserve">Notifications</w:t>
+      </w:r>
+      <w:r>
+        <w:t xml:space="preserve">) → set</w:t>
+      </w:r>
+      <w:r>
+        <w:t xml:space="preserve"> </w:t>
+      </w:r>
+      <w:r>
+        <w:rPr>
+          <w:b/>
+          <w:bCs/>
+        </w:rPr>
+        <w:t xml:space="preserve">Default notifications</w:t>
+      </w:r>
+      <w:r>
+        <w:t xml:space="preserve"> </w:t>
+      </w:r>
+      <w:r>
+        <w:t xml:space="preserve">to</w:t>
+      </w:r>
+      <w:r>
+        <w:t xml:space="preserve"> </w:t>
+      </w:r>
+      <w:r>
+        <w:rPr>
+          <w:b/>
+          <w:bCs/>
+        </w:rPr>
+        <w:t xml:space="preserve">None</w:t>
+      </w:r>
+      <w:r>
+        <w:t xml:space="preserve">.</w:t>
+      </w:r>
+      <w:r>
+        <w:t xml:space="preserve"> </w:t>
+      </w:r>
+      <w:r>
+        <w:t xml:space="preserve">- Alternatively, delete the reminder manually from each event after saving it.</w:t>
+      </w:r>
+    </w:p>
+    <w:p>
+      <w:pPr>
+        <w:pStyle w:val="BlockText"/>
+      </w:pPr>
+      <w:r>
+        <w:rPr>
+          <w:b/>
+          <w:bCs/>
+        </w:rPr>
+        <w:t xml:space="preserve">Note:</w:t>
+      </w:r>
+      <w:r>
+        <w:t xml:space="preserve"> </w:t>
+      </w:r>
+      <w:r>
+        <w:t xml:space="preserve">Apple Calendar export does not have this problem — the app suppresses alarms automatically.</w:t>
       </w:r>
     </w:p>
     <w:bookmarkStart w:id="38" w:name="ios-instructions"/>

</xml_diff>

<commit_message>
Update Scheduler Guide: web version + Expo Go sign-in instructions
Quickstart now shows both options: web version (no account) and
Expo Go (free account required, with sign-up steps).

Co-Authored-By: Claude Sonnet 4.6 <noreply@anthropic.com>
</commit_message>
<xml_diff>
--- a/VSS_2026_Scheduler_Guide.docx
+++ b/VSS_2026_Scheduler_Guide.docx
@@ -26,17 +26,13 @@
       </w:pPr>
       <w:r>
         <w:rPr>
-          <w:b/>
-          <w:bCs/>
-        </w:rPr>
-        <w:t xml:space="preserve">No account or setup needed.</w:t>
-      </w:r>
-      <w:r>
-        <w:t xml:space="preserve"> </w:t>
-      </w:r>
-      <w:r>
-        <w:t xml:space="preserve">Just install the free Expo Go app and scan this QR code:</w:t>
-      </w:r>
+          <w:b w:val="0"/>
+          <w:bCs/>
+        </w:rPr>
+        <w:t>Two ways to access the app:</w:t>
+      </w:r>
+      <w:r/>
+      <w:r/>
     </w:p>
     <w:p>
       <w:pPr>
@@ -99,61 +95,35 @@
       </w:pPr>
       <w:r>
         <w:rPr>
-          <w:b/>
-          <w:bCs/>
-        </w:rPr>
-        <w:t xml:space="preserve">iPhone:</w:t>
-      </w:r>
-      <w:r>
-        <w:t xml:space="preserve"> </w:t>
-      </w:r>
-      <w:r>
-        <w:t xml:space="preserve">1. Download</w:t>
-      </w:r>
-      <w:r>
-        <w:t xml:space="preserve"> </w:t>
-      </w:r>
-      <w:r>
-        <w:rPr>
-          <w:b/>
-          <w:bCs/>
-        </w:rPr>
-        <w:t xml:space="preserve">Expo Go</w:t>
-      </w:r>
-      <w:r>
-        <w:t xml:space="preserve"> </w:t>
-      </w:r>
-      <w:r>
-        <w:t xml:space="preserve">from the App Store</w:t>
-      </w:r>
-      <w:r>
-        <w:t xml:space="preserve"> </w:t>
-      </w:r>
-      <w:r>
-        <w:t xml:space="preserve">2. Open the</w:t>
-      </w:r>
-      <w:r>
-        <w:t xml:space="preserve"> </w:t>
-      </w:r>
-      <w:r>
-        <w:rPr>
-          <w:b/>
-          <w:bCs/>
-        </w:rPr>
-        <w:t xml:space="preserve">Camera app</w:t>
-      </w:r>
-      <w:r>
-        <w:t xml:space="preserve"> </w:t>
-      </w:r>
-      <w:r>
-        <w:t xml:space="preserve">and point it at the QR code</w:t>
-      </w:r>
-      <w:r>
-        <w:t xml:space="preserve"> </w:t>
-      </w:r>
-      <w:r>
-        <w:t xml:space="preserve">3. Tap the notification that appears — it opens the app in Expo Go automatically</w:t>
-      </w:r>
+          <w:b w:val="0"/>
+          <w:bCs/>
+        </w:rPr>
+        <w:t>Web version (no account needed): Open markwgreenlee.github.io/vss-2026-scheduler in any phone browser. Tip: load it before arriving at the venue so it works on slow conference WiFi.</w:t>
+      </w:r>
+      <w:r/>
+      <w:r/>
+      <w:r/>
+      <w:r>
+        <w:rPr>
+          <w:b/>
+          <w:bCs/>
+        </w:rPr>
+      </w:r>
+      <w:r/>
+      <w:r/>
+      <w:r/>
+      <w:r/>
+      <w:r/>
+      <w:r>
+        <w:rPr>
+          <w:b/>
+          <w:bCs/>
+        </w:rPr>
+      </w:r>
+      <w:r/>
+      <w:r/>
+      <w:r/>
+      <w:r/>
     </w:p>
     <w:p>
       <w:pPr>
@@ -161,55 +131,33 @@
       </w:pPr>
       <w:r>
         <w:rPr>
-          <w:b/>
-          <w:bCs/>
-        </w:rPr>
-        <w:t xml:space="preserve">Android:</w:t>
-      </w:r>
-      <w:r>
-        <w:t xml:space="preserve"> </w:t>
-      </w:r>
-      <w:r>
-        <w:t xml:space="preserve">1. Download</w:t>
-      </w:r>
-      <w:r>
-        <w:t xml:space="preserve"> </w:t>
-      </w:r>
-      <w:r>
-        <w:rPr>
-          <w:b/>
-          <w:bCs/>
-        </w:rPr>
-        <w:t xml:space="preserve">Expo Go</w:t>
-      </w:r>
-      <w:r>
-        <w:t xml:space="preserve"> </w:t>
-      </w:r>
-      <w:r>
-        <w:t xml:space="preserve">from the Google Play Store</w:t>
-      </w:r>
-      <w:r>
-        <w:t xml:space="preserve"> </w:t>
-      </w:r>
-      <w:r>
-        <w:t xml:space="preserve">2. Open Expo Go and tap</w:t>
-      </w:r>
-      <w:r>
-        <w:t xml:space="preserve"> </w:t>
-      </w:r>
-      <w:r>
-        <w:rPr>
-          <w:b/>
-          <w:bCs/>
-        </w:rPr>
-        <w:t xml:space="preserve">Scan QR Code</w:t>
-      </w:r>
-      <w:r>
-        <w:t xml:space="preserve"> </w:t>
-      </w:r>
-      <w:r>
-        <w:t xml:space="preserve">3. Point the camera at the QR code — the app loads immediately</w:t>
-      </w:r>
+          <w:b w:val="0"/>
+          <w:bCs/>
+        </w:rPr>
+        <w:t>Expo Go app (Apple Calendar support — free account required): 1. Install Expo Go from the App Store or Google Play. 2. Tap Log in → Sign up to create a free account (Google, Apple, or email). 3. Once signed in, scan the QR code above with your Camera app. 4. Tap the notification — the app opens automatically. Returning users: just scan the QR code.</w:t>
+      </w:r>
+      <w:r/>
+      <w:r/>
+      <w:r/>
+      <w:r>
+        <w:rPr>
+          <w:b/>
+          <w:bCs/>
+        </w:rPr>
+      </w:r>
+      <w:r/>
+      <w:r/>
+      <w:r/>
+      <w:r/>
+      <w:r/>
+      <w:r>
+        <w:rPr>
+          <w:b/>
+          <w:bCs/>
+        </w:rPr>
+      </w:r>
+      <w:r/>
+      <w:r/>
     </w:p>
     <w:p>
       <w:r>
@@ -6806,17 +6754,13 @@
       </w:pPr>
       <w:r>
         <w:rPr>
-          <w:b/>
-          <w:bCs/>
-        </w:rPr>
-        <w:t xml:space="preserve">Recommended:</w:t>
-      </w:r>
-      <w:r>
-        <w:t xml:space="preserve"> </w:t>
-      </w:r>
-      <w:r>
-        <w:t xml:space="preserve">Use Expo Go for testing, then build APK for conference.</w:t>
-      </w:r>
+          <w:b w:val="0"/>
+          <w:bCs/>
+        </w:rPr>
+        <w:t>Recommended: Use the web version for instant access (no account needed). Use Expo Go with a free account for Apple Calendar export.</w:t>
+      </w:r>
+      <w:r/>
+      <w:r/>
     </w:p>
     <w:p>
       <w:r>

</xml_diff>